<commit_message>
bap6 reply-brief: typst/docx on the shared cross-engine layout model, on fb-595.63's docx engine (docx/reference.xml, fb render's multi-pass TOC and TOA pages, the opening brief's filter with the reply CFG); docx XENG-001..003 pass, cross_engine: gate (fb-595.54.3)
</commit_message>
<xml_diff>
--- a/courts/sixth-circuit/bankruptcy-appellate-panel/reply-brief/usage/OUTPUT-reply-brief.docx
+++ b/courts/sixth-circuit/bankruptcy-appellate-panel/reply-brief/usage/OUTPUT-reply-brief.docx
@@ -4,15 +4,21 @@
   <w:body>
     <w:p>
       <w:pPr>
-        <w:pStyle w:val="Centered"/>
-      </w:pPr>
-      <w:r>
-        <w:t xml:space="preserve">Case No. 19-8005</w:t>
-      </w:r>
-    </w:p>
-    <w:p>
-      <w:pPr>
-        <w:pStyle w:val="CoverGap"/>
+        <w:pStyle w:val="BapLine"/>
+        <w:spacing w:before="0" w:after="0" w:line="364" w:lineRule="exact"/>
+        <w:jc w:val="center"/>
+      </w:pPr>
+      <w:r>
+        <w:t xml:space="preserve">Case No. 19</w:t>
+        <w:noBreakHyphen/>
+        <w:t xml:space="preserve">8005</w:t>
+      </w:r>
+    </w:p>
+    <w:p>
+      <w:pPr>
+        <w:pStyle w:val="BapLine"/>
+        <w:spacing w:before="252" w:after="0" w:line="364" w:lineRule="exact"/>
+        <w:jc w:val="center"/>
       </w:pPr>
       <w:r>
         <w:rPr>
@@ -24,39 +30,121 @@
     </w:p>
     <w:p>
       <w:pPr>
-        <w:pStyle w:val="CoverGap"/>
-      </w:pPr>
-      <w:r>
-        <w:t xml:space="preserve">Dinsmore &amp; Shohl LLP</w:t>
-      </w:r>
-    </w:p>
-    <w:p>
-      <w:pPr>
-        <w:pStyle w:val="Centered"/>
-      </w:pPr>
-      <w:r>
-        <w:t xml:space="preserve">Bingham Greenebaum Doll LLP</w:t>
-      </w:r>
-    </w:p>
-    <w:p>
-      <w:pPr>
-        <w:pStyle w:val="Centered"/>
-      </w:pPr>
-      <w:r>
-        <w:t xml:space="preserve">Fox Rothschild LLP</w:t>
-      </w:r>
-    </w:p>
-    <w:p>
-      <w:pPr>
-        <w:pStyle w:val="Centered"/>
-      </w:pPr>
-      <w:r>
-        <w:t xml:space="preserve">and Phoenix Management Services, LLC</w:t>
-      </w:r>
-    </w:p>
-    <w:p>
-      <w:pPr>
-        <w:pStyle w:val="Centered"/>
+        <w:pStyle w:val="BapLine"/>
+        <w:spacing w:before="252" w:after="0" w:line="364" w:lineRule="exact"/>
+        <w:jc w:val="center"/>
+      </w:pPr>
+      <w:r>
+        <w:t xml:space="preserve">Dinsmore</w:t>
+      </w:r>
+      <w:r>
+        <w:t xml:space="preserve"> </w:t>
+      </w:r>
+      <w:r>
+        <w:t xml:space="preserve">&amp;</w:t>
+      </w:r>
+      <w:r>
+        <w:t xml:space="preserve"> </w:t>
+      </w:r>
+      <w:r>
+        <w:t xml:space="preserve">Shohl</w:t>
+      </w:r>
+      <w:r>
+        <w:t xml:space="preserve"> </w:t>
+      </w:r>
+      <w:r>
+        <w:t xml:space="preserve">LLP</w:t>
+      </w:r>
+    </w:p>
+    <w:p>
+      <w:pPr>
+        <w:pStyle w:val="BapLine"/>
+        <w:spacing w:before="0" w:after="0" w:line="364" w:lineRule="exact"/>
+        <w:jc w:val="center"/>
+      </w:pPr>
+      <w:r>
+        <w:t xml:space="preserve">Bingham</w:t>
+      </w:r>
+      <w:r>
+        <w:t xml:space="preserve"> </w:t>
+      </w:r>
+      <w:r>
+        <w:t xml:space="preserve">Greenebaum</w:t>
+      </w:r>
+      <w:r>
+        <w:t xml:space="preserve"> </w:t>
+      </w:r>
+      <w:r>
+        <w:t xml:space="preserve">Doll</w:t>
+      </w:r>
+      <w:r>
+        <w:t xml:space="preserve"> </w:t>
+      </w:r>
+      <w:r>
+        <w:t xml:space="preserve">LLP</w:t>
+      </w:r>
+    </w:p>
+    <w:p>
+      <w:pPr>
+        <w:pStyle w:val="BapLine"/>
+        <w:spacing w:before="0" w:after="0" w:line="364" w:lineRule="exact"/>
+        <w:jc w:val="center"/>
+      </w:pPr>
+      <w:r>
+        <w:t xml:space="preserve">Fox</w:t>
+      </w:r>
+      <w:r>
+        <w:t xml:space="preserve"> </w:t>
+      </w:r>
+      <w:r>
+        <w:t xml:space="preserve">Rothschild</w:t>
+      </w:r>
+      <w:r>
+        <w:t xml:space="preserve"> </w:t>
+      </w:r>
+      <w:r>
+        <w:t xml:space="preserve">LLP</w:t>
+      </w:r>
+    </w:p>
+    <w:p>
+      <w:pPr>
+        <w:pStyle w:val="BapLine"/>
+        <w:spacing w:before="0" w:after="0" w:line="364" w:lineRule="exact"/>
+        <w:jc w:val="center"/>
+      </w:pPr>
+      <w:r>
+        <w:t xml:space="preserve">and</w:t>
+      </w:r>
+      <w:r>
+        <w:t xml:space="preserve"> </w:t>
+      </w:r>
+      <w:r>
+        <w:t xml:space="preserve">Phoenix</w:t>
+      </w:r>
+      <w:r>
+        <w:t xml:space="preserve"> </w:t>
+      </w:r>
+      <w:r>
+        <w:t xml:space="preserve">Management</w:t>
+      </w:r>
+      <w:r>
+        <w:t xml:space="preserve"> </w:t>
+      </w:r>
+      <w:r>
+        <w:t xml:space="preserve">Services,</w:t>
+      </w:r>
+      <w:r>
+        <w:t xml:space="preserve"> </w:t>
+      </w:r>
+      <w:r>
+        <w:t xml:space="preserve">LLC</w:t>
+      </w:r>
+    </w:p>
+    <w:p>
+      <w:pPr>
+        <w:pStyle w:val="BapLine"/>
+        <w:spacing w:before="0" w:after="0" w:line="364" w:lineRule="exact"/>
+        <w:jc w:val="center"/>
       </w:pPr>
       <w:r>
         <w:t xml:space="preserve">Appellants,</w:t>
@@ -64,7 +152,9 @@
     </w:p>
     <w:p>
       <w:pPr>
-        <w:pStyle w:val="CoverGap"/>
+        <w:pStyle w:val="BapLine"/>
+        <w:spacing w:before="252" w:after="0" w:line="364" w:lineRule="exact"/>
+        <w:jc w:val="center"/>
       </w:pPr>
       <w:r>
         <w:t xml:space="preserve">v.</w:t>
@@ -72,15 +162,31 @@
     </w:p>
     <w:p>
       <w:pPr>
-        <w:pStyle w:val="CoverGap"/>
-      </w:pPr>
-      <w:r>
-        <w:t xml:space="preserve">United Cumberland Bank</w:t>
-      </w:r>
-    </w:p>
-    <w:p>
-      <w:pPr>
-        <w:pStyle w:val="Centered"/>
+        <w:pStyle w:val="BapLine"/>
+        <w:spacing w:before="252" w:after="0" w:line="364" w:lineRule="exact"/>
+        <w:jc w:val="center"/>
+      </w:pPr>
+      <w:r>
+        <w:t xml:space="preserve">United</w:t>
+      </w:r>
+      <w:r>
+        <w:t xml:space="preserve"> </w:t>
+      </w:r>
+      <w:r>
+        <w:t xml:space="preserve">Cumberland</w:t>
+      </w:r>
+      <w:r>
+        <w:t xml:space="preserve"> </w:t>
+      </w:r>
+      <w:r>
+        <w:t xml:space="preserve">Bank</w:t>
+      </w:r>
+    </w:p>
+    <w:p>
+      <w:pPr>
+        <w:pStyle w:val="BapLine"/>
+        <w:spacing w:before="0" w:after="0" w:line="364" w:lineRule="exact"/>
+        <w:jc w:val="center"/>
       </w:pPr>
       <w:r>
         <w:t xml:space="preserve">Appellee.</w:t>
@@ -88,63 +194,315 @@
     </w:p>
     <w:p>
       <w:pPr>
-        <w:pStyle w:val="CoverWide"/>
-      </w:pPr>
-      <w:r>
-        <w:t xml:space="preserve">On Appeal from the United States Bankruptcy Court for the Western District of Kentucky. Originating Case No. 16-10407, Chapter 11, Hon. Joan A. Lloyd.</w:t>
-      </w:r>
-    </w:p>
-    <w:p>
-      <w:pPr>
-        <w:pStyle w:val="CoverTitle"/>
-      </w:pPr>
-      <w:r>
-        <w:t xml:space="preserve">Appellants’ Reply Brief</w:t>
-      </w:r>
-    </w:p>
-    <w:p>
-      <w:pPr>
-        <w:pStyle w:val="CoverBottom"/>
-      </w:pPr>
-      <w:r>
-        <w:t xml:space="preserve">James R. Irving</w:t>
-      </w:r>
-    </w:p>
-    <w:p>
-      <w:pPr>
-        <w:pStyle w:val="Centered"/>
-      </w:pPr>
-      <w:r>
-        <w:t xml:space="preserve">Kyle W. Miller</w:t>
-      </w:r>
-    </w:p>
-    <w:p>
-      <w:pPr>
-        <w:pStyle w:val="Centered"/>
-      </w:pPr>
-      <w:r>
-        <w:t xml:space="preserve">BINGHAM GREENEBAUM DOLL LLP</w:t>
-      </w:r>
-    </w:p>
-    <w:p>
-      <w:pPr>
-        <w:pStyle w:val="Centered"/>
-      </w:pPr>
-      <w:r>
-        <w:t xml:space="preserve">3500 PNC Tower, 101 South Fifth Street</w:t>
-      </w:r>
-    </w:p>
-    <w:p>
-      <w:pPr>
-        <w:pStyle w:val="Centered"/>
-      </w:pPr>
-      <w:r>
-        <w:t xml:space="preserve">Louisville, Kentucky 40202</w:t>
-      </w:r>
-    </w:p>
-    <w:p>
-      <w:pPr>
-        <w:pStyle w:val="Centered"/>
+        <w:pStyle w:val="BapLine"/>
+        <w:spacing w:before="392" w:after="0" w:line="364" w:lineRule="exact"/>
+        <w:jc w:val="center"/>
+      </w:pPr>
+      <w:r>
+        <w:t xml:space="preserve">On</w:t>
+      </w:r>
+      <w:r>
+        <w:t xml:space="preserve"> </w:t>
+      </w:r>
+      <w:r>
+        <w:t xml:space="preserve">Appeal</w:t>
+      </w:r>
+      <w:r>
+        <w:t xml:space="preserve"> </w:t>
+      </w:r>
+      <w:r>
+        <w:t xml:space="preserve">from</w:t>
+      </w:r>
+      <w:r>
+        <w:t xml:space="preserve"> </w:t>
+      </w:r>
+      <w:r>
+        <w:t xml:space="preserve">the</w:t>
+      </w:r>
+      <w:r>
+        <w:t xml:space="preserve"> </w:t>
+      </w:r>
+      <w:r>
+        <w:t xml:space="preserve">United</w:t>
+      </w:r>
+      <w:r>
+        <w:t xml:space="preserve"> </w:t>
+      </w:r>
+      <w:r>
+        <w:t xml:space="preserve">States</w:t>
+      </w:r>
+      <w:r>
+        <w:t xml:space="preserve"> </w:t>
+      </w:r>
+      <w:r>
+        <w:t xml:space="preserve">Bankruptcy</w:t>
+      </w:r>
+      <w:r>
+        <w:t xml:space="preserve"> </w:t>
+      </w:r>
+      <w:r>
+        <w:t xml:space="preserve">Court</w:t>
+      </w:r>
+      <w:r>
+        <w:t xml:space="preserve"> </w:t>
+      </w:r>
+      <w:r>
+        <w:t xml:space="preserve">for</w:t>
+      </w:r>
+      <w:r>
+        <w:t xml:space="preserve"> </w:t>
+      </w:r>
+      <w:r>
+        <w:t xml:space="preserve">the</w:t>
+      </w:r>
+      <w:r>
+        <w:t xml:space="preserve"> </w:t>
+      </w:r>
+      <w:r>
+        <w:t xml:space="preserve">Western</w:t>
+      </w:r>
+      <w:r>
+        <w:t xml:space="preserve"> </w:t>
+      </w:r>
+      <w:r>
+        <w:t xml:space="preserve">District</w:t>
+      </w:r>
+      <w:r>
+        <w:t xml:space="preserve"> </w:t>
+      </w:r>
+      <w:r>
+        <w:t xml:space="preserve">of</w:t>
+      </w:r>
+      <w:r>
+        <w:t xml:space="preserve"> </w:t>
+      </w:r>
+      <w:r>
+        <w:t xml:space="preserve">Kentucky.</w:t>
+      </w:r>
+      <w:r>
+        <w:t xml:space="preserve"> </w:t>
+      </w:r>
+      <w:r>
+        <w:t xml:space="preserve">Originating</w:t>
+      </w:r>
+      <w:r>
+        <w:t xml:space="preserve"> </w:t>
+      </w:r>
+      <w:r>
+        <w:t xml:space="preserve">Case</w:t>
+      </w:r>
+      <w:r>
+        <w:t xml:space="preserve"> </w:t>
+      </w:r>
+      <w:r>
+        <w:t xml:space="preserve">No.</w:t>
+      </w:r>
+      <w:r>
+        <w:t xml:space="preserve"> </w:t>
+      </w:r>
+      <w:r>
+        <w:t xml:space="preserve">16</w:t>
+        <w:noBreakHyphen/>
+        <w:t xml:space="preserve">10407,</w:t>
+      </w:r>
+      <w:r>
+        <w:t xml:space="preserve"> </w:t>
+      </w:r>
+      <w:r>
+        <w:t xml:space="preserve">Chapter</w:t>
+      </w:r>
+      <w:r>
+        <w:t xml:space="preserve"> </w:t>
+      </w:r>
+      <w:r>
+        <w:t xml:space="preserve">11,</w:t>
+      </w:r>
+      <w:r>
+        <w:t xml:space="preserve"> </w:t>
+      </w:r>
+      <w:r>
+        <w:t xml:space="preserve">Hon.</w:t>
+      </w:r>
+      <w:r>
+        <w:t xml:space="preserve"> </w:t>
+      </w:r>
+      <w:r>
+        <w:t xml:space="preserve">Joan</w:t>
+      </w:r>
+      <w:r>
+        <w:t xml:space="preserve"> </w:t>
+      </w:r>
+      <w:r>
+        <w:t xml:space="preserve">A.</w:t>
+      </w:r>
+      <w:r>
+        <w:t xml:space="preserve"> </w:t>
+      </w:r>
+      <w:r>
+        <w:t xml:space="preserve">Lloyd.</w:t>
+      </w:r>
+    </w:p>
+    <w:p>
+      <w:pPr>
+        <w:pStyle w:val="BapLine"/>
+        <w:spacing w:before="392" w:after="0" w:line="364" w:lineRule="exact"/>
+        <w:jc w:val="center"/>
+      </w:pPr>
+      <w:r>
+        <w:rPr>
+          <w:b/>
+          <w:bCs/>
+          <w:sz w:val="32"/>
+          <w:szCs w:val="32"/>
+        </w:rPr>
+        <w:t xml:space="preserve">APPELLANTS’ REPLY BRIEF</w:t>
+      </w:r>
+    </w:p>
+    <w:p>
+      <w:pPr>
+        <w:pStyle w:val="BapLine"/>
+        <w:spacing w:before="728" w:after="0" w:line="364" w:lineRule="exact"/>
+        <w:jc w:val="center"/>
+      </w:pPr>
+      <w:r>
+        <w:t xml:space="preserve">James</w:t>
+      </w:r>
+      <w:r>
+        <w:t xml:space="preserve"> </w:t>
+      </w:r>
+      <w:r>
+        <w:t xml:space="preserve">R.</w:t>
+      </w:r>
+      <w:r>
+        <w:t xml:space="preserve"> </w:t>
+      </w:r>
+      <w:r>
+        <w:t xml:space="preserve">Irving</w:t>
+      </w:r>
+    </w:p>
+    <w:p>
+      <w:pPr>
+        <w:pStyle w:val="BapLine"/>
+        <w:spacing w:before="0" w:after="0" w:line="364" w:lineRule="exact"/>
+        <w:jc w:val="center"/>
+      </w:pPr>
+      <w:r>
+        <w:t xml:space="preserve">Kyle</w:t>
+      </w:r>
+      <w:r>
+        <w:t xml:space="preserve"> </w:t>
+      </w:r>
+      <w:r>
+        <w:t xml:space="preserve">W.</w:t>
+      </w:r>
+      <w:r>
+        <w:t xml:space="preserve"> </w:t>
+      </w:r>
+      <w:r>
+        <w:t xml:space="preserve">Miller</w:t>
+      </w:r>
+    </w:p>
+    <w:p>
+      <w:pPr>
+        <w:pStyle w:val="BapLine"/>
+        <w:spacing w:before="0" w:after="0" w:line="364" w:lineRule="exact"/>
+        <w:jc w:val="center"/>
+      </w:pPr>
+      <w:r>
+        <w:t xml:space="preserve">BINGHAM</w:t>
+      </w:r>
+      <w:r>
+        <w:t xml:space="preserve"> </w:t>
+      </w:r>
+      <w:r>
+        <w:t xml:space="preserve">GREENEBAUM</w:t>
+      </w:r>
+      <w:r>
+        <w:t xml:space="preserve"> </w:t>
+      </w:r>
+      <w:r>
+        <w:t xml:space="preserve">DOLL</w:t>
+      </w:r>
+      <w:r>
+        <w:t xml:space="preserve"> </w:t>
+      </w:r>
+      <w:r>
+        <w:t xml:space="preserve">LLP</w:t>
+      </w:r>
+    </w:p>
+    <w:p>
+      <w:pPr>
+        <w:pStyle w:val="BapLine"/>
+        <w:spacing w:before="0" w:after="0" w:line="364" w:lineRule="exact"/>
+        <w:jc w:val="center"/>
+      </w:pPr>
+      <w:r>
+        <w:t xml:space="preserve">3500</w:t>
+      </w:r>
+      <w:r>
+        <w:t xml:space="preserve"> </w:t>
+      </w:r>
+      <w:r>
+        <w:t xml:space="preserve">PNC</w:t>
+      </w:r>
+      <w:r>
+        <w:t xml:space="preserve"> </w:t>
+      </w:r>
+      <w:r>
+        <w:t xml:space="preserve">Tower,</w:t>
+      </w:r>
+      <w:r>
+        <w:t xml:space="preserve"> </w:t>
+      </w:r>
+      <w:r>
+        <w:t xml:space="preserve">101</w:t>
+      </w:r>
+      <w:r>
+        <w:t xml:space="preserve"> </w:t>
+      </w:r>
+      <w:r>
+        <w:t xml:space="preserve">South</w:t>
+      </w:r>
+      <w:r>
+        <w:t xml:space="preserve"> </w:t>
+      </w:r>
+      <w:r>
+        <w:t xml:space="preserve">Fifth</w:t>
+      </w:r>
+      <w:r>
+        <w:t xml:space="preserve"> </w:t>
+      </w:r>
+      <w:r>
+        <w:t xml:space="preserve">Street</w:t>
+      </w:r>
+    </w:p>
+    <w:p>
+      <w:pPr>
+        <w:pStyle w:val="BapLine"/>
+        <w:spacing w:before="0" w:after="0" w:line="364" w:lineRule="exact"/>
+        <w:jc w:val="center"/>
+      </w:pPr>
+      <w:r>
+        <w:t xml:space="preserve">Louisville,</w:t>
+      </w:r>
+      <w:r>
+        <w:t xml:space="preserve"> </w:t>
+      </w:r>
+      <w:r>
+        <w:t xml:space="preserve">Kentucky</w:t>
+      </w:r>
+      <w:r>
+        <w:t xml:space="preserve"> </w:t>
+      </w:r>
+      <w:r>
+        <w:t xml:space="preserve">40202</w:t>
+      </w:r>
+    </w:p>
+    <w:p>
+      <w:pPr>
+        <w:pStyle w:val="BapLine"/>
+        <w:spacing w:before="0" w:after="0" w:line="364" w:lineRule="exact"/>
+        <w:jc w:val="center"/>
       </w:pPr>
       <w:r>
         <w:t xml:space="preserve">kmiller@bgdlegal.com</w:t>
@@ -152,39 +510,121 @@
     </w:p>
     <w:p>
       <w:pPr>
-        <w:pStyle w:val="CoverGroup"/>
-      </w:pPr>
-      <w:r>
-        <w:t xml:space="preserve">Ellen Arvin Kennedy</w:t>
-      </w:r>
-    </w:p>
-    <w:p>
-      <w:pPr>
-        <w:pStyle w:val="Centered"/>
-      </w:pPr>
-      <w:r>
-        <w:t xml:space="preserve">DINSMORE &amp; SHOHL LLP</w:t>
-      </w:r>
-    </w:p>
-    <w:p>
-      <w:pPr>
-        <w:pStyle w:val="Centered"/>
-      </w:pPr>
-      <w:r>
-        <w:t xml:space="preserve">250 W. Main Street, Suite 1400</w:t>
-      </w:r>
-    </w:p>
-    <w:p>
-      <w:pPr>
-        <w:pStyle w:val="Centered"/>
-      </w:pPr>
-      <w:r>
-        <w:t xml:space="preserve">Lexington, Kentucky 40507</w:t>
-      </w:r>
-    </w:p>
-    <w:p>
-      <w:pPr>
-        <w:pStyle w:val="Centered"/>
+        <w:pStyle w:val="BapLine"/>
+        <w:spacing w:before="252" w:after="0" w:line="364" w:lineRule="exact"/>
+        <w:jc w:val="center"/>
+      </w:pPr>
+      <w:r>
+        <w:t xml:space="preserve">Ellen</w:t>
+      </w:r>
+      <w:r>
+        <w:t xml:space="preserve"> </w:t>
+      </w:r>
+      <w:r>
+        <w:t xml:space="preserve">Arvin</w:t>
+      </w:r>
+      <w:r>
+        <w:t xml:space="preserve"> </w:t>
+      </w:r>
+      <w:r>
+        <w:t xml:space="preserve">Kennedy</w:t>
+      </w:r>
+    </w:p>
+    <w:p>
+      <w:pPr>
+        <w:pStyle w:val="BapLine"/>
+        <w:spacing w:before="0" w:after="0" w:line="364" w:lineRule="exact"/>
+        <w:jc w:val="center"/>
+      </w:pPr>
+      <w:r>
+        <w:t xml:space="preserve">DINSMORE</w:t>
+      </w:r>
+      <w:r>
+        <w:t xml:space="preserve"> </w:t>
+      </w:r>
+      <w:r>
+        <w:t xml:space="preserve">&amp;</w:t>
+      </w:r>
+      <w:r>
+        <w:t xml:space="preserve"> </w:t>
+      </w:r>
+      <w:r>
+        <w:t xml:space="preserve">SHOHL</w:t>
+      </w:r>
+      <w:r>
+        <w:t xml:space="preserve"> </w:t>
+      </w:r>
+      <w:r>
+        <w:t xml:space="preserve">LLP</w:t>
+      </w:r>
+    </w:p>
+    <w:p>
+      <w:pPr>
+        <w:pStyle w:val="BapLine"/>
+        <w:spacing w:before="0" w:after="0" w:line="364" w:lineRule="exact"/>
+        <w:jc w:val="center"/>
+      </w:pPr>
+      <w:r>
+        <w:t xml:space="preserve">250</w:t>
+      </w:r>
+      <w:r>
+        <w:t xml:space="preserve"> </w:t>
+      </w:r>
+      <w:r>
+        <w:t xml:space="preserve">W.</w:t>
+      </w:r>
+      <w:r>
+        <w:t xml:space="preserve"> </w:t>
+      </w:r>
+      <w:r>
+        <w:t xml:space="preserve">Main</w:t>
+      </w:r>
+      <w:r>
+        <w:t xml:space="preserve"> </w:t>
+      </w:r>
+      <w:r>
+        <w:t xml:space="preserve">Street,</w:t>
+      </w:r>
+      <w:r>
+        <w:t xml:space="preserve"> </w:t>
+      </w:r>
+      <w:r>
+        <w:t xml:space="preserve">Suite</w:t>
+      </w:r>
+      <w:r>
+        <w:t xml:space="preserve"> </w:t>
+      </w:r>
+      <w:r>
+        <w:t xml:space="preserve">1400</w:t>
+      </w:r>
+    </w:p>
+    <w:p>
+      <w:pPr>
+        <w:pStyle w:val="BapLine"/>
+        <w:spacing w:before="0" w:after="0" w:line="364" w:lineRule="exact"/>
+        <w:jc w:val="center"/>
+      </w:pPr>
+      <w:r>
+        <w:t xml:space="preserve">Lexington,</w:t>
+      </w:r>
+      <w:r>
+        <w:t xml:space="preserve"> </w:t>
+      </w:r>
+      <w:r>
+        <w:t xml:space="preserve">Kentucky</w:t>
+      </w:r>
+      <w:r>
+        <w:t xml:space="preserve"> </w:t>
+      </w:r>
+      <w:r>
+        <w:t xml:space="preserve">40507</w:t>
+      </w:r>
+    </w:p>
+    <w:p>
+      <w:pPr>
+        <w:pStyle w:val="BapLine"/>
+        <w:spacing w:before="0" w:after="0" w:line="364" w:lineRule="exact"/>
+        <w:jc w:val="center"/>
       </w:pPr>
       <w:r>
         <w:t xml:space="preserve">ellen.kennedy@dinsmore.com</w:t>
@@ -192,47 +632,89 @@
     </w:p>
     <w:p>
       <w:pPr>
-        <w:pStyle w:val="CoverGroup"/>
-      </w:pPr>
-      <w:r>
-        <w:t xml:space="preserve">(502) 587-3606</w:t>
-      </w:r>
-    </w:p>
-    <w:p>
-      <w:pPr>
-        <w:pStyle w:val="CoverDate"/>
-      </w:pPr>
-      <w:r>
-        <w:t xml:space="preserve">September 12, 2019</w:t>
-      </w:r>
-    </w:p>
-    <w:p>
-      <w:pPr>
-        <w:pStyle w:val="SectionEnd"/>
+        <w:pStyle w:val="BapLine"/>
+        <w:spacing w:before="252" w:after="0" w:line="364" w:lineRule="exact"/>
+        <w:jc w:val="center"/>
+      </w:pPr>
+      <w:r>
+        <w:t xml:space="preserve">(502)</w:t>
+      </w:r>
+      <w:r>
+        <w:t xml:space="preserve"> </w:t>
+      </w:r>
+      <w:r>
+        <w:t xml:space="preserve">587</w:t>
+        <w:noBreakHyphen/>
+        <w:t xml:space="preserve">3606</w:t>
+      </w:r>
+    </w:p>
+    <w:p>
+      <w:pPr>
+        <w:pStyle w:val="BapLine"/>
+        <w:spacing w:before="224" w:after="0" w:line="364" w:lineRule="exact"/>
+        <w:jc w:val="center"/>
+      </w:pPr>
+      <w:r>
+        <w:t xml:space="preserve">September</w:t>
+      </w:r>
+      <w:r>
+        <w:t xml:space="preserve"> </w:t>
+      </w:r>
+      <w:r>
+        <w:t xml:space="preserve">12,</w:t>
+      </w:r>
+      <w:r>
+        <w:t xml:space="preserve"> </w:t>
+      </w:r>
+      <w:r>
+        <w:t xml:space="preserve">2019</w:t>
+      </w:r>
+    </w:p>
+    <w:p>
+      <w:pPr>
+        <w:spacing w:before="0" w:after="0" w:line="20" w:lineRule="exact"/>
         <w:sectPr>
           <w:footerReference w:type="default" r:id="rIdFtrNone"/>
           <w:pgSz w:w="12240" w:h="15840"/>
           <w:pgMar w:top="1440" w:right="1440" w:bottom="1440" w:left="1440" w:header="720" w:footer="720" w:gutter="0"/>
-          <w:cols w:space="720"/>
         </w:sectPr>
       </w:pPr>
     </w:p>
     <w:p>
       <w:pPr>
-        <w:pStyle w:val="ContentsHeading"/>
-      </w:pPr>
-      <w:r>
+        <w:pStyle w:val="BapLine"/>
+        <w:keepNext/>
+        <w:keepLines/>
+        <w:spacing w:before="0" w:after="336" w:line="480" w:lineRule="exact"/>
+        <w:jc w:val="center"/>
+      </w:pPr>
+      <w:r>
+        <w:rPr>
+          <w:b/>
+          <w:bCs/>
+          <w:sz w:val="39"/>
+          <w:szCs w:val="39"/>
+        </w:rPr>
         <w:t xml:space="preserve">Table of Contents</w:t>
       </w:r>
     </w:p>
     <w:p>
       <w:pPr>
-        <w:pStyle w:val="TOCEntry1"/>
+        <w:pStyle w:val="BapLine"/>
+        <w:keepLines/>
+        <w:tabs>
+          <w:tab w:val="right" w:leader="dot" w:pos="9360"/>
+        </w:tabs>
+        <w:spacing w:before="140" w:after="0" w:line="364" w:lineRule="exact"/>
+        <w:ind w:left="420" w:right="720" w:hanging="420"/>
       </w:pPr>
       <w:r>
         <w:t xml:space="preserve">Table of Authorities</w:t>
       </w:r>
       <w:r>
+        <w:t xml:space="preserve">   </w:t>
+      </w:r>
+      <w:r>
         <w:tab/>
       </w:r>
       <w:r>
@@ -241,12 +723,21 @@
     </w:p>
     <w:p>
       <w:pPr>
-        <w:pStyle w:val="TOCEntry1"/>
+        <w:pStyle w:val="BapLine"/>
+        <w:keepLines/>
+        <w:tabs>
+          <w:tab w:val="right" w:leader="dot" w:pos="9360"/>
+        </w:tabs>
+        <w:spacing w:before="140" w:after="0" w:line="364" w:lineRule="exact"/>
+        <w:ind w:left="420" w:right="720" w:hanging="420"/>
       </w:pPr>
       <w:r>
         <w:t xml:space="preserve">Introduction</w:t>
       </w:r>
       <w:r>
+        <w:t xml:space="preserve">   </w:t>
+      </w:r>
+      <w:r>
         <w:tab/>
       </w:r>
       <w:r>
@@ -255,12 +746,21 @@
     </w:p>
     <w:p>
       <w:pPr>
-        <w:pStyle w:val="TOCEntry1"/>
+        <w:pStyle w:val="BapLine"/>
+        <w:keepLines/>
+        <w:tabs>
+          <w:tab w:val="right" w:leader="dot" w:pos="9360"/>
+        </w:tabs>
+        <w:spacing w:before="140" w:after="0" w:line="364" w:lineRule="exact"/>
+        <w:ind w:left="420" w:right="720" w:hanging="420"/>
       </w:pPr>
       <w:r>
         <w:t xml:space="preserve">Argument</w:t>
       </w:r>
       <w:r>
+        <w:t xml:space="preserve">   </w:t>
+      </w:r>
+      <w:r>
         <w:tab/>
       </w:r>
       <w:r>
@@ -269,10 +769,85 @@
     </w:p>
     <w:p>
       <w:pPr>
-        <w:pStyle w:val="TOCEntry2"/>
-      </w:pPr>
-      <w:r>
-        <w:t xml:space="preserve">I. If Affirmed, the Bankruptcy Court’s Opinion Would Hamper Future Bankruptcy Reorganizations.</w:t>
+        <w:pStyle w:val="BapLine"/>
+        <w:keepLines/>
+        <w:tabs>
+          <w:tab w:val="right" w:leader="dot" w:pos="9360"/>
+        </w:tabs>
+        <w:spacing w:before="140" w:after="0" w:line="364" w:lineRule="exact"/>
+        <w:ind w:left="840" w:right="720" w:hanging="420"/>
+      </w:pPr>
+      <w:r>
+        <w:t xml:space="preserve">I.</w:t>
+      </w:r>
+      <w:r>
+        <w:t xml:space="preserve"> </w:t>
+      </w:r>
+      <w:r>
+        <w:t xml:space="preserve">If</w:t>
+      </w:r>
+      <w:r>
+        <w:t xml:space="preserve"> </w:t>
+      </w:r>
+      <w:r>
+        <w:t xml:space="preserve">Affirmed,</w:t>
+      </w:r>
+      <w:r>
+        <w:t xml:space="preserve"> </w:t>
+      </w:r>
+      <w:r>
+        <w:t xml:space="preserve">the</w:t>
+      </w:r>
+      <w:r>
+        <w:t xml:space="preserve"> </w:t>
+      </w:r>
+      <w:r>
+        <w:t xml:space="preserve">Bankruptcy</w:t>
+      </w:r>
+      <w:r>
+        <w:t xml:space="preserve"> </w:t>
+      </w:r>
+      <w:r>
+        <w:t xml:space="preserve">Court’s</w:t>
+      </w:r>
+      <w:r>
+        <w:t xml:space="preserve"> </w:t>
+      </w:r>
+      <w:r>
+        <w:t xml:space="preserve">Opinion</w:t>
+      </w:r>
+      <w:r>
+        <w:t xml:space="preserve"> </w:t>
+      </w:r>
+      <w:r>
+        <w:t xml:space="preserve">Would</w:t>
+      </w:r>
+      <w:r>
+        <w:t xml:space="preserve"> </w:t>
+      </w:r>
+      <w:r>
+        <w:t xml:space="preserve">Hamper</w:t>
+      </w:r>
+      <w:r>
+        <w:t xml:space="preserve"> </w:t>
+      </w:r>
+      <w:r>
+        <w:t xml:space="preserve">Future</w:t>
+      </w:r>
+      <w:r>
+        <w:t xml:space="preserve"> </w:t>
+      </w:r>
+      <w:r>
+        <w:t xml:space="preserve">Bankruptcy</w:t>
+      </w:r>
+      <w:r>
+        <w:t xml:space="preserve"> </w:t>
+      </w:r>
+      <w:r>
+        <w:t xml:space="preserve">Reorganizations.</w:t>
+      </w:r>
+      <w:r>
+        <w:t xml:space="preserve">   </w:t>
       </w:r>
       <w:r>
         <w:tab/>
@@ -283,10 +858,85 @@
     </w:p>
     <w:p>
       <w:pPr>
-        <w:pStyle w:val="TOCEntry2"/>
-      </w:pPr>
-      <w:r>
-        <w:t xml:space="preserve">II. The Cash Collateral Orders Subordinate UCB’s Liens to the Professionals’ Fees.</w:t>
+        <w:pStyle w:val="BapLine"/>
+        <w:keepLines/>
+        <w:tabs>
+          <w:tab w:val="right" w:leader="dot" w:pos="9360"/>
+        </w:tabs>
+        <w:spacing w:before="140" w:after="0" w:line="364" w:lineRule="exact"/>
+        <w:ind w:left="840" w:right="720" w:hanging="420"/>
+      </w:pPr>
+      <w:r>
+        <w:t xml:space="preserve">II.</w:t>
+      </w:r>
+      <w:r>
+        <w:t xml:space="preserve"> </w:t>
+      </w:r>
+      <w:r>
+        <w:t xml:space="preserve">The</w:t>
+      </w:r>
+      <w:r>
+        <w:t xml:space="preserve"> </w:t>
+      </w:r>
+      <w:r>
+        <w:t xml:space="preserve">Cash</w:t>
+      </w:r>
+      <w:r>
+        <w:t xml:space="preserve"> </w:t>
+      </w:r>
+      <w:r>
+        <w:t xml:space="preserve">Collateral</w:t>
+      </w:r>
+      <w:r>
+        <w:t xml:space="preserve"> </w:t>
+      </w:r>
+      <w:r>
+        <w:t xml:space="preserve">Orders</w:t>
+      </w:r>
+      <w:r>
+        <w:t xml:space="preserve"> </w:t>
+      </w:r>
+      <w:r>
+        <w:t xml:space="preserve">Subordinate</w:t>
+      </w:r>
+      <w:r>
+        <w:t xml:space="preserve"> </w:t>
+      </w:r>
+      <w:r>
+        <w:t xml:space="preserve">UCB’s</w:t>
+      </w:r>
+      <w:r>
+        <w:t xml:space="preserve"> </w:t>
+      </w:r>
+      <w:r>
+        <w:t xml:space="preserve">Liens</w:t>
+      </w:r>
+      <w:r>
+        <w:t xml:space="preserve"> </w:t>
+      </w:r>
+      <w:r>
+        <w:t xml:space="preserve">to</w:t>
+      </w:r>
+      <w:r>
+        <w:t xml:space="preserve"> </w:t>
+      </w:r>
+      <w:r>
+        <w:t xml:space="preserve">the</w:t>
+      </w:r>
+      <w:r>
+        <w:t xml:space="preserve"> </w:t>
+      </w:r>
+      <w:r>
+        <w:t xml:space="preserve">Professionals’</w:t>
+      </w:r>
+      <w:r>
+        <w:t xml:space="preserve"> </w:t>
+      </w:r>
+      <w:r>
+        <w:t xml:space="preserve">Fees.</w:t>
+      </w:r>
+      <w:r>
+        <w:t xml:space="preserve">   </w:t>
       </w:r>
       <w:r>
         <w:tab/>
@@ -297,10 +947,85 @@
     </w:p>
     <w:p>
       <w:pPr>
-        <w:pStyle w:val="TOCEntry2"/>
-      </w:pPr>
-      <w:r>
-        <w:t xml:space="preserve">III. The Plan of Reorganization Affirms the Professionals’ Rights to the Carve-Out.</w:t>
+        <w:pStyle w:val="BapLine"/>
+        <w:keepLines/>
+        <w:tabs>
+          <w:tab w:val="right" w:leader="dot" w:pos="9360"/>
+        </w:tabs>
+        <w:spacing w:before="140" w:after="0" w:line="364" w:lineRule="exact"/>
+        <w:ind w:left="840" w:right="720" w:hanging="420"/>
+      </w:pPr>
+      <w:r>
+        <w:t xml:space="preserve">III.</w:t>
+      </w:r>
+      <w:r>
+        <w:t xml:space="preserve"> </w:t>
+      </w:r>
+      <w:r>
+        <w:t xml:space="preserve">The</w:t>
+      </w:r>
+      <w:r>
+        <w:t xml:space="preserve"> </w:t>
+      </w:r>
+      <w:r>
+        <w:t xml:space="preserve">Plan</w:t>
+      </w:r>
+      <w:r>
+        <w:t xml:space="preserve"> </w:t>
+      </w:r>
+      <w:r>
+        <w:t xml:space="preserve">of</w:t>
+      </w:r>
+      <w:r>
+        <w:t xml:space="preserve"> </w:t>
+      </w:r>
+      <w:r>
+        <w:t xml:space="preserve">Reorganization</w:t>
+      </w:r>
+      <w:r>
+        <w:t xml:space="preserve"> </w:t>
+      </w:r>
+      <w:r>
+        <w:t xml:space="preserve">Affirms</w:t>
+      </w:r>
+      <w:r>
+        <w:t xml:space="preserve"> </w:t>
+      </w:r>
+      <w:r>
+        <w:t xml:space="preserve">the</w:t>
+      </w:r>
+      <w:r>
+        <w:t xml:space="preserve"> </w:t>
+      </w:r>
+      <w:r>
+        <w:t xml:space="preserve">Professionals’</w:t>
+      </w:r>
+      <w:r>
+        <w:t xml:space="preserve"> </w:t>
+      </w:r>
+      <w:r>
+        <w:t xml:space="preserve">Rights</w:t>
+      </w:r>
+      <w:r>
+        <w:t xml:space="preserve"> </w:t>
+      </w:r>
+      <w:r>
+        <w:t xml:space="preserve">to</w:t>
+      </w:r>
+      <w:r>
+        <w:t xml:space="preserve"> </w:t>
+      </w:r>
+      <w:r>
+        <w:t xml:space="preserve">the</w:t>
+      </w:r>
+      <w:r>
+        <w:t xml:space="preserve"> </w:t>
+      </w:r>
+      <w:r>
+        <w:t xml:space="preserve">Carve-Out.</w:t>
+      </w:r>
+      <w:r>
+        <w:t xml:space="preserve">   </w:t>
       </w:r>
       <w:r>
         <w:tab/>
@@ -311,10 +1036,49 @@
     </w:p>
     <w:p>
       <w:pPr>
-        <w:pStyle w:val="TOCEntry3"/>
-      </w:pPr>
-      <w:r>
-        <w:t xml:space="preserve">A. The Plan Retains The Carve-Out.</w:t>
+        <w:pStyle w:val="BapLine"/>
+        <w:keepLines/>
+        <w:tabs>
+          <w:tab w:val="right" w:leader="dot" w:pos="9360"/>
+        </w:tabs>
+        <w:spacing w:before="140" w:after="0" w:line="364" w:lineRule="exact"/>
+        <w:ind w:left="1260" w:right="720" w:hanging="420"/>
+      </w:pPr>
+      <w:r>
+        <w:t xml:space="preserve">A.</w:t>
+      </w:r>
+      <w:r>
+        <w:t xml:space="preserve"> </w:t>
+      </w:r>
+      <w:r>
+        <w:t xml:space="preserve">The</w:t>
+      </w:r>
+      <w:r>
+        <w:t xml:space="preserve"> </w:t>
+      </w:r>
+      <w:r>
+        <w:t xml:space="preserve">Plan</w:t>
+      </w:r>
+      <w:r>
+        <w:t xml:space="preserve"> </w:t>
+      </w:r>
+      <w:r>
+        <w:t xml:space="preserve">Retains</w:t>
+      </w:r>
+      <w:r>
+        <w:t xml:space="preserve"> </w:t>
+      </w:r>
+      <w:r>
+        <w:t xml:space="preserve">The</w:t>
+      </w:r>
+      <w:r>
+        <w:t xml:space="preserve"> </w:t>
+      </w:r>
+      <w:r>
+        <w:t xml:space="preserve">Carve-Out.</w:t>
+      </w:r>
+      <w:r>
+        <w:t xml:space="preserve">   </w:t>
       </w:r>
       <w:r>
         <w:tab/>
@@ -325,10 +1089,91 @@
     </w:p>
     <w:p>
       <w:pPr>
-        <w:pStyle w:val="TOCEntry3"/>
-      </w:pPr>
-      <w:r>
-        <w:t xml:space="preserve">B. The Professionals Did Not Release UCB From Its Obligations Under The Carve-Out.</w:t>
+        <w:pStyle w:val="BapLine"/>
+        <w:keepLines/>
+        <w:tabs>
+          <w:tab w:val="right" w:leader="dot" w:pos="9360"/>
+        </w:tabs>
+        <w:spacing w:before="140" w:after="0" w:line="364" w:lineRule="exact"/>
+        <w:ind w:left="1260" w:right="720" w:hanging="420"/>
+      </w:pPr>
+      <w:r>
+        <w:t xml:space="preserve">B.</w:t>
+      </w:r>
+      <w:r>
+        <w:t xml:space="preserve"> </w:t>
+      </w:r>
+      <w:r>
+        <w:t xml:space="preserve">The</w:t>
+      </w:r>
+      <w:r>
+        <w:t xml:space="preserve"> </w:t>
+      </w:r>
+      <w:r>
+        <w:t xml:space="preserve">Professionals</w:t>
+      </w:r>
+      <w:r>
+        <w:t xml:space="preserve"> </w:t>
+      </w:r>
+      <w:r>
+        <w:t xml:space="preserve">Did</w:t>
+      </w:r>
+      <w:r>
+        <w:t xml:space="preserve"> </w:t>
+      </w:r>
+      <w:r>
+        <w:t xml:space="preserve">Not</w:t>
+      </w:r>
+      <w:r>
+        <w:t xml:space="preserve"> </w:t>
+      </w:r>
+      <w:r>
+        <w:t xml:space="preserve">Release</w:t>
+      </w:r>
+      <w:r>
+        <w:t xml:space="preserve"> </w:t>
+      </w:r>
+      <w:r>
+        <w:t xml:space="preserve">UCB</w:t>
+      </w:r>
+      <w:r>
+        <w:t xml:space="preserve"> </w:t>
+      </w:r>
+      <w:r>
+        <w:t xml:space="preserve">From</w:t>
+      </w:r>
+      <w:r>
+        <w:t xml:space="preserve"> </w:t>
+      </w:r>
+      <w:r>
+        <w:t xml:space="preserve">Its</w:t>
+      </w:r>
+      <w:r>
+        <w:t xml:space="preserve"> </w:t>
+      </w:r>
+      <w:r>
+        <w:t xml:space="preserve">Obligations</w:t>
+      </w:r>
+      <w:r>
+        <w:t xml:space="preserve"> </w:t>
+      </w:r>
+      <w:r>
+        <w:t xml:space="preserve">Under</w:t>
+      </w:r>
+      <w:r>
+        <w:t xml:space="preserve"> </w:t>
+      </w:r>
+      <w:r>
+        <w:t xml:space="preserve">The</w:t>
+      </w:r>
+      <w:r>
+        <w:t xml:space="preserve"> </w:t>
+      </w:r>
+      <w:r>
+        <w:t xml:space="preserve">Carve-Out.</w:t>
+      </w:r>
+      <w:r>
+        <w:t xml:space="preserve">   </w:t>
       </w:r>
       <w:r>
         <w:tab/>
@@ -339,12 +1184,21 @@
     </w:p>
     <w:p>
       <w:pPr>
-        <w:pStyle w:val="TOCEntry1"/>
+        <w:pStyle w:val="BapLine"/>
+        <w:keepLines/>
+        <w:tabs>
+          <w:tab w:val="right" w:leader="dot" w:pos="9360"/>
+        </w:tabs>
+        <w:spacing w:before="140" w:after="0" w:line="364" w:lineRule="exact"/>
+        <w:ind w:left="420" w:right="720" w:hanging="420"/>
       </w:pPr>
       <w:r>
         <w:t xml:space="preserve">Conclusion</w:t>
       </w:r>
       <w:r>
+        <w:t xml:space="preserve">   </w:t>
+      </w:r>
+      <w:r>
         <w:tab/>
       </w:r>
       <w:r>
@@ -353,33 +1207,236 @@
     </w:p>
     <w:p>
       <w:pPr>
-        <w:pStyle w:val="AuthoritiesHeading"/>
-      </w:pPr>
-      <w:r>
+        <w:pStyle w:val="BapLine"/>
+        <w:keepNext/>
+        <w:keepLines/>
+        <w:pageBreakBefore/>
+        <w:spacing w:before="0" w:after="336" w:line="480" w:lineRule="exact"/>
+        <w:jc w:val="center"/>
+      </w:pPr>
+      <w:r>
+        <w:rPr>
+          <w:b/>
+          <w:bCs/>
+          <w:sz w:val="39"/>
+          <w:szCs w:val="39"/>
+        </w:rPr>
         <w:t xml:space="preserve">Table of Authorities</w:t>
       </w:r>
     </w:p>
     <w:p>
       <w:pPr>
-        <w:pStyle w:val="AuthorityKind"/>
-      </w:pPr>
-      <w:r>
+        <w:pStyle w:val="BapLine"/>
+        <w:keepNext/>
+        <w:keepLines/>
+        <w:spacing w:before="336" w:after="224" w:line="364" w:lineRule="exact"/>
+      </w:pPr>
+      <w:r>
+        <w:rPr>
+          <w:b/>
+          <w:bCs/>
+        </w:rPr>
         <w:t xml:space="preserve">Cases</w:t>
       </w:r>
     </w:p>
     <w:p>
       <w:pPr>
-        <w:pStyle w:val="TOAEntry"/>
-      </w:pPr>
-      <w:r>
-        <w:rPr>
-          <w:i/>
-          <w:iCs/>
-        </w:rPr>
-        <w:t xml:space="preserve">Denver &amp; R.G. W. R. Co. v. Goldman, Sachs &amp; Co.</w:t>
-      </w:r>
-      <w:r>
-        <w:t xml:space="preserve">, 212 F.2d 627 (10th Cir. 1954)</w:t>
+        <w:pStyle w:val="BapLine"/>
+        <w:keepLines/>
+        <w:tabs>
+          <w:tab w:val="right" w:leader="dot" w:pos="9360"/>
+        </w:tabs>
+        <w:spacing w:before="140" w:after="0" w:line="364" w:lineRule="exact"/>
+        <w:ind w:left="720" w:right="1120" w:hanging="720"/>
+      </w:pPr>
+      <w:r>
+        <w:rPr>
+          <w:i/>
+          <w:iCs/>
+        </w:rPr>
+        <w:t xml:space="preserve">Denver</w:t>
+      </w:r>
+      <w:r>
+        <w:rPr>
+          <w:i/>
+          <w:iCs/>
+        </w:rPr>
+        <w:t xml:space="preserve"> </w:t>
+      </w:r>
+      <w:r>
+        <w:rPr>
+          <w:i/>
+          <w:iCs/>
+        </w:rPr>
+        <w:t xml:space="preserve">&amp;</w:t>
+      </w:r>
+      <w:r>
+        <w:rPr>
+          <w:i/>
+          <w:iCs/>
+        </w:rPr>
+        <w:t xml:space="preserve"> </w:t>
+      </w:r>
+      <w:r>
+        <w:rPr>
+          <w:i/>
+          <w:iCs/>
+        </w:rPr>
+        <w:t xml:space="preserve">R.G.</w:t>
+      </w:r>
+      <w:r>
+        <w:rPr>
+          <w:i/>
+          <w:iCs/>
+        </w:rPr>
+        <w:t xml:space="preserve"> </w:t>
+      </w:r>
+      <w:r>
+        <w:rPr>
+          <w:i/>
+          <w:iCs/>
+        </w:rPr>
+        <w:t xml:space="preserve">W.</w:t>
+      </w:r>
+      <w:r>
+        <w:rPr>
+          <w:i/>
+          <w:iCs/>
+        </w:rPr>
+        <w:t xml:space="preserve"> </w:t>
+      </w:r>
+      <w:r>
+        <w:rPr>
+          <w:i/>
+          <w:iCs/>
+        </w:rPr>
+        <w:t xml:space="preserve">R.</w:t>
+      </w:r>
+      <w:r>
+        <w:rPr>
+          <w:i/>
+          <w:iCs/>
+        </w:rPr>
+        <w:t xml:space="preserve"> </w:t>
+      </w:r>
+      <w:r>
+        <w:rPr>
+          <w:i/>
+          <w:iCs/>
+        </w:rPr>
+        <w:t xml:space="preserve">Co.</w:t>
+      </w:r>
+      <w:r>
+        <w:rPr>
+          <w:i/>
+          <w:iCs/>
+        </w:rPr>
+        <w:t xml:space="preserve"> </w:t>
+      </w:r>
+      <w:r>
+        <w:rPr>
+          <w:i/>
+          <w:iCs/>
+        </w:rPr>
+        <w:t xml:space="preserve">v.</w:t>
+      </w:r>
+      <w:r>
+        <w:rPr>
+          <w:i/>
+          <w:iCs/>
+        </w:rPr>
+        <w:t xml:space="preserve"> </w:t>
+      </w:r>
+      <w:r>
+        <w:rPr>
+          <w:i/>
+          <w:iCs/>
+        </w:rPr>
+        <w:t xml:space="preserve">Goldman,</w:t>
+      </w:r>
+      <w:r>
+        <w:rPr>
+          <w:i/>
+          <w:iCs/>
+        </w:rPr>
+        <w:t xml:space="preserve"> </w:t>
+      </w:r>
+      <w:r>
+        <w:rPr>
+          <w:i/>
+          <w:iCs/>
+        </w:rPr>
+        <w:t xml:space="preserve">Sachs</w:t>
+      </w:r>
+      <w:r>
+        <w:rPr>
+          <w:i/>
+          <w:iCs/>
+        </w:rPr>
+        <w:t xml:space="preserve"> </w:t>
+      </w:r>
+      <w:r>
+        <w:rPr>
+          <w:i/>
+          <w:iCs/>
+        </w:rPr>
+        <w:t xml:space="preserve">&amp;</w:t>
+      </w:r>
+      <w:r>
+        <w:rPr>
+          <w:i/>
+          <w:iCs/>
+        </w:rPr>
+        <w:t xml:space="preserve"> </w:t>
+      </w:r>
+      <w:r>
+        <w:rPr>
+          <w:i/>
+          <w:iCs/>
+        </w:rPr>
+        <w:t xml:space="preserve">Co.</w:t>
+      </w:r>
+      <w:r>
+        <w:t xml:space="preserve">,</w:t>
+      </w:r>
+      <w:r>
+        <w:t xml:space="preserve"> </w:t>
+      </w:r>
+      <w:r>
+        <w:t xml:space="preserve">212</w:t>
+      </w:r>
+      <w:r>
+        <w:t xml:space="preserve"> </w:t>
+      </w:r>
+      <w:r>
+        <w:t xml:space="preserve">F.2d</w:t>
+      </w:r>
+      <w:r>
+        <w:t xml:space="preserve"> </w:t>
+      </w:r>
+      <w:r>
+        <w:t xml:space="preserve">627</w:t>
+      </w:r>
+      <w:r>
+        <w:t xml:space="preserve"> </w:t>
+      </w:r>
+      <w:r>
+        <w:t xml:space="preserve">(10th</w:t>
+      </w:r>
+      <w:r>
+        <w:t xml:space="preserve"> </w:t>
+      </w:r>
+      <w:r>
+        <w:t xml:space="preserve">Cir.</w:t>
+      </w:r>
+      <w:r>
+        <w:t xml:space="preserve"> </w:t>
+      </w:r>
+      <w:r>
+        <w:t xml:space="preserve">1954)</w:t>
+      </w:r>
+      <w:r>
+        <w:t xml:space="preserve">   </w:t>
       </w:r>
       <w:r>
         <w:tab/>
@@ -390,17 +1447,118 @@
     </w:p>
     <w:p>
       <w:pPr>
-        <w:pStyle w:val="TOAEntry"/>
-      </w:pPr>
-      <w:r>
-        <w:rPr>
-          <w:i/>
-          <w:iCs/>
-        </w:rPr>
-        <w:t xml:space="preserve">In re Ames Dep’t Stores</w:t>
-      </w:r>
-      <w:r>
-        <w:t xml:space="preserve">, 115 B.R. 34 (Bankr. S.D.N.Y. 1990)</w:t>
+        <w:pStyle w:val="BapLine"/>
+        <w:keepLines/>
+        <w:tabs>
+          <w:tab w:val="right" w:leader="dot" w:pos="9360"/>
+        </w:tabs>
+        <w:spacing w:before="140" w:after="0" w:line="364" w:lineRule="exact"/>
+        <w:ind w:left="720" w:right="1120" w:hanging="720"/>
+      </w:pPr>
+      <w:r>
+        <w:rPr>
+          <w:i/>
+          <w:iCs/>
+        </w:rPr>
+        <w:t xml:space="preserve">In</w:t>
+      </w:r>
+      <w:r>
+        <w:rPr>
+          <w:i/>
+          <w:iCs/>
+        </w:rPr>
+        <w:t xml:space="preserve"> </w:t>
+      </w:r>
+      <w:r>
+        <w:rPr>
+          <w:i/>
+          <w:iCs/>
+        </w:rPr>
+        <w:t xml:space="preserve">re</w:t>
+      </w:r>
+      <w:r>
+        <w:rPr>
+          <w:i/>
+          <w:iCs/>
+        </w:rPr>
+        <w:t xml:space="preserve"> </w:t>
+      </w:r>
+      <w:r>
+        <w:rPr>
+          <w:i/>
+          <w:iCs/>
+        </w:rPr>
+        <w:t xml:space="preserve">Ames</w:t>
+      </w:r>
+      <w:r>
+        <w:rPr>
+          <w:i/>
+          <w:iCs/>
+        </w:rPr>
+        <w:t xml:space="preserve"> </w:t>
+      </w:r>
+      <w:r>
+        <w:rPr>
+          <w:i/>
+          <w:iCs/>
+        </w:rPr>
+        <w:t xml:space="preserve">Dep’t</w:t>
+      </w:r>
+      <w:r>
+        <w:rPr>
+          <w:i/>
+          <w:iCs/>
+        </w:rPr>
+        <w:t xml:space="preserve"> </w:t>
+      </w:r>
+      <w:r>
+        <w:rPr>
+          <w:i/>
+          <w:iCs/>
+        </w:rPr>
+        <w:t xml:space="preserve">Stores</w:t>
+      </w:r>
+      <w:r>
+        <w:t xml:space="preserve">,</w:t>
+      </w:r>
+      <w:r>
+        <w:t xml:space="preserve"> </w:t>
+      </w:r>
+      <w:r>
+        <w:t xml:space="preserve">115</w:t>
+      </w:r>
+      <w:r>
+        <w:t xml:space="preserve"> </w:t>
+      </w:r>
+      <w:r>
+        <w:t xml:space="preserve">B.R.</w:t>
+      </w:r>
+      <w:r>
+        <w:t xml:space="preserve"> </w:t>
+      </w:r>
+      <w:r>
+        <w:t xml:space="preserve">34</w:t>
+      </w:r>
+      <w:r>
+        <w:t xml:space="preserve"> </w:t>
+      </w:r>
+      <w:r>
+        <w:t xml:space="preserve">(Bankr.</w:t>
+      </w:r>
+      <w:r>
+        <w:t xml:space="preserve"> </w:t>
+      </w:r>
+      <w:r>
+        <w:t xml:space="preserve">S.D.N.Y.</w:t>
+      </w:r>
+      <w:r>
+        <w:t xml:space="preserve"> </w:t>
+      </w:r>
+      <w:r>
+        <w:t xml:space="preserve">1990)</w:t>
+      </w:r>
+      <w:r>
+        <w:t xml:space="preserve">   </w:t>
       </w:r>
       <w:r>
         <w:tab/>
@@ -411,17 +1569,138 @@
     </w:p>
     <w:p>
       <w:pPr>
-        <w:pStyle w:val="TOAEntry"/>
-      </w:pPr>
-      <w:r>
-        <w:rPr>
-          <w:i/>
-          <w:iCs/>
-        </w:rPr>
-        <w:t xml:space="preserve">In re Evanston Beauty Supply, Inc.</w:t>
-      </w:r>
-      <w:r>
-        <w:t xml:space="preserve">, 136 B.R. 171 (Bankr. N.D. Ill. 1992)</w:t>
+        <w:pStyle w:val="BapLine"/>
+        <w:keepLines/>
+        <w:tabs>
+          <w:tab w:val="right" w:leader="dot" w:pos="9360"/>
+        </w:tabs>
+        <w:spacing w:before="140" w:after="0" w:line="364" w:lineRule="exact"/>
+        <w:ind w:left="720" w:right="1120" w:hanging="720"/>
+      </w:pPr>
+      <w:r>
+        <w:rPr>
+          <w:i/>
+          <w:iCs/>
+        </w:rPr>
+        <w:t xml:space="preserve">In</w:t>
+      </w:r>
+      <w:r>
+        <w:rPr>
+          <w:i/>
+          <w:iCs/>
+        </w:rPr>
+        <w:t xml:space="preserve"> </w:t>
+      </w:r>
+      <w:r>
+        <w:rPr>
+          <w:i/>
+          <w:iCs/>
+        </w:rPr>
+        <w:t xml:space="preserve">re</w:t>
+      </w:r>
+      <w:r>
+        <w:rPr>
+          <w:i/>
+          <w:iCs/>
+        </w:rPr>
+        <w:t xml:space="preserve"> </w:t>
+      </w:r>
+      <w:r>
+        <w:rPr>
+          <w:i/>
+          <w:iCs/>
+        </w:rPr>
+        <w:t xml:space="preserve">Evanston</w:t>
+      </w:r>
+      <w:r>
+        <w:rPr>
+          <w:i/>
+          <w:iCs/>
+        </w:rPr>
+        <w:t xml:space="preserve"> </w:t>
+      </w:r>
+      <w:r>
+        <w:rPr>
+          <w:i/>
+          <w:iCs/>
+        </w:rPr>
+        <w:t xml:space="preserve">Beauty</w:t>
+      </w:r>
+      <w:r>
+        <w:rPr>
+          <w:i/>
+          <w:iCs/>
+        </w:rPr>
+        <w:t xml:space="preserve"> </w:t>
+      </w:r>
+      <w:r>
+        <w:rPr>
+          <w:i/>
+          <w:iCs/>
+        </w:rPr>
+        <w:t xml:space="preserve">Supply,</w:t>
+      </w:r>
+      <w:r>
+        <w:rPr>
+          <w:i/>
+          <w:iCs/>
+        </w:rPr>
+        <w:t xml:space="preserve"> </w:t>
+      </w:r>
+      <w:r>
+        <w:rPr>
+          <w:i/>
+          <w:iCs/>
+        </w:rPr>
+        <w:t xml:space="preserve">Inc.</w:t>
+      </w:r>
+      <w:r>
+        <w:t xml:space="preserve">,</w:t>
+      </w:r>
+      <w:r>
+        <w:t xml:space="preserve"> </w:t>
+      </w:r>
+      <w:r>
+        <w:t xml:space="preserve">136</w:t>
+      </w:r>
+      <w:r>
+        <w:t xml:space="preserve"> </w:t>
+      </w:r>
+      <w:r>
+        <w:t xml:space="preserve">B.R.</w:t>
+      </w:r>
+      <w:r>
+        <w:t xml:space="preserve"> </w:t>
+      </w:r>
+      <w:r>
+        <w:t xml:space="preserve">171</w:t>
+      </w:r>
+      <w:r>
+        <w:t xml:space="preserve"> </w:t>
+      </w:r>
+      <w:r>
+        <w:t xml:space="preserve">(Bankr.</w:t>
+      </w:r>
+      <w:r>
+        <w:t xml:space="preserve"> </w:t>
+      </w:r>
+      <w:r>
+        <w:t xml:space="preserve">N.D.</w:t>
+      </w:r>
+      <w:r>
+        <w:t xml:space="preserve"> </w:t>
+      </w:r>
+      <w:r>
+        <w:t xml:space="preserve">Ill.</w:t>
+      </w:r>
+      <w:r>
+        <w:t xml:space="preserve"> </w:t>
+      </w:r>
+      <w:r>
+        <w:t xml:space="preserve">1992)</w:t>
+      </w:r>
+      <w:r>
+        <w:t xml:space="preserve">   </w:t>
       </w:r>
       <w:r>
         <w:tab/>
@@ -432,17 +1711,110 @@
     </w:p>
     <w:p>
       <w:pPr>
-        <w:pStyle w:val="TOAEntry"/>
-      </w:pPr>
-      <w:r>
-        <w:rPr>
-          <w:i/>
-          <w:iCs/>
-        </w:rPr>
-        <w:t xml:space="preserve">In re Fibermark, Inc.</w:t>
-      </w:r>
-      <w:r>
-        <w:t xml:space="preserve">, 349 B.R. 385 (Bankr. D. Vt. 2006)</w:t>
+        <w:pStyle w:val="BapLine"/>
+        <w:keepLines/>
+        <w:tabs>
+          <w:tab w:val="right" w:leader="dot" w:pos="9360"/>
+        </w:tabs>
+        <w:spacing w:before="140" w:after="0" w:line="364" w:lineRule="exact"/>
+        <w:ind w:left="720" w:right="1120" w:hanging="720"/>
+      </w:pPr>
+      <w:r>
+        <w:rPr>
+          <w:i/>
+          <w:iCs/>
+        </w:rPr>
+        <w:t xml:space="preserve">In</w:t>
+      </w:r>
+      <w:r>
+        <w:rPr>
+          <w:i/>
+          <w:iCs/>
+        </w:rPr>
+        <w:t xml:space="preserve"> </w:t>
+      </w:r>
+      <w:r>
+        <w:rPr>
+          <w:i/>
+          <w:iCs/>
+        </w:rPr>
+        <w:t xml:space="preserve">re</w:t>
+      </w:r>
+      <w:r>
+        <w:rPr>
+          <w:i/>
+          <w:iCs/>
+        </w:rPr>
+        <w:t xml:space="preserve"> </w:t>
+      </w:r>
+      <w:r>
+        <w:rPr>
+          <w:i/>
+          <w:iCs/>
+        </w:rPr>
+        <w:t xml:space="preserve">Fibermark,</w:t>
+      </w:r>
+      <w:r>
+        <w:rPr>
+          <w:i/>
+          <w:iCs/>
+        </w:rPr>
+        <w:t xml:space="preserve"> </w:t>
+      </w:r>
+      <w:r>
+        <w:rPr>
+          <w:i/>
+          <w:iCs/>
+        </w:rPr>
+        <w:t xml:space="preserve">Inc.</w:t>
+      </w:r>
+      <w:r>
+        <w:t xml:space="preserve">,</w:t>
+      </w:r>
+      <w:r>
+        <w:t xml:space="preserve"> </w:t>
+      </w:r>
+      <w:r>
+        <w:t xml:space="preserve">349</w:t>
+      </w:r>
+      <w:r>
+        <w:t xml:space="preserve"> </w:t>
+      </w:r>
+      <w:r>
+        <w:t xml:space="preserve">B.R.</w:t>
+      </w:r>
+      <w:r>
+        <w:t xml:space="preserve"> </w:t>
+      </w:r>
+      <w:r>
+        <w:t xml:space="preserve">385</w:t>
+      </w:r>
+      <w:r>
+        <w:t xml:space="preserve"> </w:t>
+      </w:r>
+      <w:r>
+        <w:t xml:space="preserve">(Bankr.</w:t>
+      </w:r>
+      <w:r>
+        <w:t xml:space="preserve"> </w:t>
+      </w:r>
+      <w:r>
+        <w:t xml:space="preserve">D.</w:t>
+      </w:r>
+      <w:r>
+        <w:t xml:space="preserve"> </w:t>
+      </w:r>
+      <w:r>
+        <w:t xml:space="preserve">Vt.</w:t>
+      </w:r>
+      <w:r>
+        <w:t xml:space="preserve"> </w:t>
+      </w:r>
+      <w:r>
+        <w:t xml:space="preserve">2006)</w:t>
+      </w:r>
+      <w:r>
+        <w:t xml:space="preserve">   </w:t>
       </w:r>
       <w:r>
         <w:tab/>
@@ -453,17 +1825,110 @@
     </w:p>
     <w:p>
       <w:pPr>
-        <w:pStyle w:val="TOAEntry"/>
-      </w:pPr>
-      <w:r>
-        <w:rPr>
-          <w:i/>
-          <w:iCs/>
-        </w:rPr>
-        <w:t xml:space="preserve">In re WorldCorp, Inc.</w:t>
-      </w:r>
-      <w:r>
-        <w:t xml:space="preserve">, 252 B.R. 890 (Bankr. D. Del. 2000)</w:t>
+        <w:pStyle w:val="BapLine"/>
+        <w:keepLines/>
+        <w:tabs>
+          <w:tab w:val="right" w:leader="dot" w:pos="9360"/>
+        </w:tabs>
+        <w:spacing w:before="140" w:after="0" w:line="364" w:lineRule="exact"/>
+        <w:ind w:left="720" w:right="1120" w:hanging="720"/>
+      </w:pPr>
+      <w:r>
+        <w:rPr>
+          <w:i/>
+          <w:iCs/>
+        </w:rPr>
+        <w:t xml:space="preserve">In</w:t>
+      </w:r>
+      <w:r>
+        <w:rPr>
+          <w:i/>
+          <w:iCs/>
+        </w:rPr>
+        <w:t xml:space="preserve"> </w:t>
+      </w:r>
+      <w:r>
+        <w:rPr>
+          <w:i/>
+          <w:iCs/>
+        </w:rPr>
+        <w:t xml:space="preserve">re</w:t>
+      </w:r>
+      <w:r>
+        <w:rPr>
+          <w:i/>
+          <w:iCs/>
+        </w:rPr>
+        <w:t xml:space="preserve"> </w:t>
+      </w:r>
+      <w:r>
+        <w:rPr>
+          <w:i/>
+          <w:iCs/>
+        </w:rPr>
+        <w:t xml:space="preserve">WorldCorp,</w:t>
+      </w:r>
+      <w:r>
+        <w:rPr>
+          <w:i/>
+          <w:iCs/>
+        </w:rPr>
+        <w:t xml:space="preserve"> </w:t>
+      </w:r>
+      <w:r>
+        <w:rPr>
+          <w:i/>
+          <w:iCs/>
+        </w:rPr>
+        <w:t xml:space="preserve">Inc.</w:t>
+      </w:r>
+      <w:r>
+        <w:t xml:space="preserve">,</w:t>
+      </w:r>
+      <w:r>
+        <w:t xml:space="preserve"> </w:t>
+      </w:r>
+      <w:r>
+        <w:t xml:space="preserve">252</w:t>
+      </w:r>
+      <w:r>
+        <w:t xml:space="preserve"> </w:t>
+      </w:r>
+      <w:r>
+        <w:t xml:space="preserve">B.R.</w:t>
+      </w:r>
+      <w:r>
+        <w:t xml:space="preserve"> </w:t>
+      </w:r>
+      <w:r>
+        <w:t xml:space="preserve">890</w:t>
+      </w:r>
+      <w:r>
+        <w:t xml:space="preserve"> </w:t>
+      </w:r>
+      <w:r>
+        <w:t xml:space="preserve">(Bankr.</w:t>
+      </w:r>
+      <w:r>
+        <w:t xml:space="preserve"> </w:t>
+      </w:r>
+      <w:r>
+        <w:t xml:space="preserve">D.</w:t>
+      </w:r>
+      <w:r>
+        <w:t xml:space="preserve"> </w:t>
+      </w:r>
+      <w:r>
+        <w:t xml:space="preserve">Del.</w:t>
+      </w:r>
+      <w:r>
+        <w:t xml:space="preserve"> </w:t>
+      </w:r>
+      <w:r>
+        <w:t xml:space="preserve">2000)</w:t>
+      </w:r>
+      <w:r>
+        <w:t xml:space="preserve">   </w:t>
       </w:r>
       <w:r>
         <w:tab/>
@@ -474,17 +1939,118 @@
     </w:p>
     <w:p>
       <w:pPr>
-        <w:pStyle w:val="TOAEntry"/>
-      </w:pPr>
-      <w:r>
-        <w:rPr>
-          <w:i/>
-          <w:iCs/>
-        </w:rPr>
-        <w:t xml:space="preserve">Louisville Water Co. v. Wells</w:t>
-      </w:r>
-      <w:r>
-        <w:t xml:space="preserve">, 664 S.W.2d 525 (Ky. App. 1984)</w:t>
+        <w:pStyle w:val="BapLine"/>
+        <w:keepLines/>
+        <w:tabs>
+          <w:tab w:val="right" w:leader="dot" w:pos="9360"/>
+        </w:tabs>
+        <w:spacing w:before="140" w:after="0" w:line="364" w:lineRule="exact"/>
+        <w:ind w:left="720" w:right="1120" w:hanging="720"/>
+      </w:pPr>
+      <w:r>
+        <w:rPr>
+          <w:i/>
+          <w:iCs/>
+        </w:rPr>
+        <w:t xml:space="preserve">Louisville</w:t>
+      </w:r>
+      <w:r>
+        <w:rPr>
+          <w:i/>
+          <w:iCs/>
+        </w:rPr>
+        <w:t xml:space="preserve"> </w:t>
+      </w:r>
+      <w:r>
+        <w:rPr>
+          <w:i/>
+          <w:iCs/>
+        </w:rPr>
+        <w:t xml:space="preserve">Water</w:t>
+      </w:r>
+      <w:r>
+        <w:rPr>
+          <w:i/>
+          <w:iCs/>
+        </w:rPr>
+        <w:t xml:space="preserve"> </w:t>
+      </w:r>
+      <w:r>
+        <w:rPr>
+          <w:i/>
+          <w:iCs/>
+        </w:rPr>
+        <w:t xml:space="preserve">Co.</w:t>
+      </w:r>
+      <w:r>
+        <w:rPr>
+          <w:i/>
+          <w:iCs/>
+        </w:rPr>
+        <w:t xml:space="preserve"> </w:t>
+      </w:r>
+      <w:r>
+        <w:rPr>
+          <w:i/>
+          <w:iCs/>
+        </w:rPr>
+        <w:t xml:space="preserve">v.</w:t>
+      </w:r>
+      <w:r>
+        <w:rPr>
+          <w:i/>
+          <w:iCs/>
+        </w:rPr>
+        <w:t xml:space="preserve"> </w:t>
+      </w:r>
+      <w:r>
+        <w:rPr>
+          <w:i/>
+          <w:iCs/>
+        </w:rPr>
+        <w:t xml:space="preserve">Wells</w:t>
+      </w:r>
+      <w:r>
+        <w:t xml:space="preserve">,</w:t>
+      </w:r>
+      <w:r>
+        <w:t xml:space="preserve"> </w:t>
+      </w:r>
+      <w:r>
+        <w:t xml:space="preserve">664</w:t>
+      </w:r>
+      <w:r>
+        <w:t xml:space="preserve"> </w:t>
+      </w:r>
+      <w:r>
+        <w:t xml:space="preserve">S.W.2d</w:t>
+      </w:r>
+      <w:r>
+        <w:t xml:space="preserve"> </w:t>
+      </w:r>
+      <w:r>
+        <w:t xml:space="preserve">525</w:t>
+      </w:r>
+      <w:r>
+        <w:t xml:space="preserve"> </w:t>
+      </w:r>
+      <w:r>
+        <w:t xml:space="preserve">(Ky.</w:t>
+      </w:r>
+      <w:r>
+        <w:t xml:space="preserve"> </w:t>
+      </w:r>
+      <w:r>
+        <w:t xml:space="preserve">App.</w:t>
+      </w:r>
+      <w:r>
+        <w:t xml:space="preserve"> </w:t>
+      </w:r>
+      <w:r>
+        <w:t xml:space="preserve">1984)</w:t>
+      </w:r>
+      <w:r>
+        <w:t xml:space="preserve">   </w:t>
       </w:r>
       <w:r>
         <w:tab/>
@@ -495,17 +2061,90 @@
     </w:p>
     <w:p>
       <w:pPr>
-        <w:pStyle w:val="TOAEntry"/>
-      </w:pPr>
-      <w:r>
-        <w:rPr>
-          <w:i/>
-          <w:iCs/>
-        </w:rPr>
-        <w:t xml:space="preserve">Palmer v. Commonwealth</w:t>
-      </w:r>
-      <w:r>
-        <w:t xml:space="preserve">, 3 S.W.3d 763 (Ky. App. 1999)</w:t>
+        <w:pStyle w:val="BapLine"/>
+        <w:keepLines/>
+        <w:tabs>
+          <w:tab w:val="right" w:leader="dot" w:pos="9360"/>
+        </w:tabs>
+        <w:spacing w:before="140" w:after="0" w:line="364" w:lineRule="exact"/>
+        <w:ind w:left="720" w:right="1120" w:hanging="720"/>
+      </w:pPr>
+      <w:r>
+        <w:rPr>
+          <w:i/>
+          <w:iCs/>
+        </w:rPr>
+        <w:t xml:space="preserve">Palmer</w:t>
+      </w:r>
+      <w:r>
+        <w:rPr>
+          <w:i/>
+          <w:iCs/>
+        </w:rPr>
+        <w:t xml:space="preserve"> </w:t>
+      </w:r>
+      <w:r>
+        <w:rPr>
+          <w:i/>
+          <w:iCs/>
+        </w:rPr>
+        <w:t xml:space="preserve">v.</w:t>
+      </w:r>
+      <w:r>
+        <w:rPr>
+          <w:i/>
+          <w:iCs/>
+        </w:rPr>
+        <w:t xml:space="preserve"> </w:t>
+      </w:r>
+      <w:r>
+        <w:rPr>
+          <w:i/>
+          <w:iCs/>
+        </w:rPr>
+        <w:t xml:space="preserve">Commonwealth</w:t>
+      </w:r>
+      <w:r>
+        <w:t xml:space="preserve">,</w:t>
+      </w:r>
+      <w:r>
+        <w:t xml:space="preserve"> </w:t>
+      </w:r>
+      <w:r>
+        <w:t xml:space="preserve">3</w:t>
+      </w:r>
+      <w:r>
+        <w:t xml:space="preserve"> </w:t>
+      </w:r>
+      <w:r>
+        <w:t xml:space="preserve">S.W.3d</w:t>
+      </w:r>
+      <w:r>
+        <w:t xml:space="preserve"> </w:t>
+      </w:r>
+      <w:r>
+        <w:t xml:space="preserve">763</w:t>
+      </w:r>
+      <w:r>
+        <w:t xml:space="preserve"> </w:t>
+      </w:r>
+      <w:r>
+        <w:t xml:space="preserve">(Ky.</w:t>
+      </w:r>
+      <w:r>
+        <w:t xml:space="preserve"> </w:t>
+      </w:r>
+      <w:r>
+        <w:t xml:space="preserve">App.</w:t>
+      </w:r>
+      <w:r>
+        <w:t xml:space="preserve"> </w:t>
+      </w:r>
+      <w:r>
+        <w:t xml:space="preserve">1999)</w:t>
+      </w:r>
+      <w:r>
+        <w:t xml:space="preserve">   </w:t>
       </w:r>
       <w:r>
         <w:tab/>
@@ -516,17 +2155,138 @@
     </w:p>
     <w:p>
       <w:pPr>
-        <w:pStyle w:val="TOAEntry"/>
-      </w:pPr>
-      <w:r>
-        <w:rPr>
-          <w:i/>
-          <w:iCs/>
-        </w:rPr>
-        <w:t xml:space="preserve">Siler v. White Star Coal Co.</w:t>
-      </w:r>
-      <w:r>
-        <w:t xml:space="preserve">, 190 Ky. 7, 226 S.W. 102 (1920)</w:t>
+        <w:pStyle w:val="BapLine"/>
+        <w:keepLines/>
+        <w:tabs>
+          <w:tab w:val="right" w:leader="dot" w:pos="9360"/>
+        </w:tabs>
+        <w:spacing w:before="140" w:after="0" w:line="364" w:lineRule="exact"/>
+        <w:ind w:left="720" w:right="1120" w:hanging="720"/>
+      </w:pPr>
+      <w:r>
+        <w:rPr>
+          <w:i/>
+          <w:iCs/>
+        </w:rPr>
+        <w:t xml:space="preserve">Siler</w:t>
+      </w:r>
+      <w:r>
+        <w:rPr>
+          <w:i/>
+          <w:iCs/>
+        </w:rPr>
+        <w:t xml:space="preserve"> </w:t>
+      </w:r>
+      <w:r>
+        <w:rPr>
+          <w:i/>
+          <w:iCs/>
+        </w:rPr>
+        <w:t xml:space="preserve">v.</w:t>
+      </w:r>
+      <w:r>
+        <w:rPr>
+          <w:i/>
+          <w:iCs/>
+        </w:rPr>
+        <w:t xml:space="preserve"> </w:t>
+      </w:r>
+      <w:r>
+        <w:rPr>
+          <w:i/>
+          <w:iCs/>
+        </w:rPr>
+        <w:t xml:space="preserve">White</w:t>
+      </w:r>
+      <w:r>
+        <w:rPr>
+          <w:i/>
+          <w:iCs/>
+        </w:rPr>
+        <w:t xml:space="preserve"> </w:t>
+      </w:r>
+      <w:r>
+        <w:rPr>
+          <w:i/>
+          <w:iCs/>
+        </w:rPr>
+        <w:t xml:space="preserve">Star</w:t>
+      </w:r>
+      <w:r>
+        <w:rPr>
+          <w:i/>
+          <w:iCs/>
+        </w:rPr>
+        <w:t xml:space="preserve"> </w:t>
+      </w:r>
+      <w:r>
+        <w:rPr>
+          <w:i/>
+          <w:iCs/>
+        </w:rPr>
+        <w:t xml:space="preserve">Coal</w:t>
+      </w:r>
+      <w:r>
+        <w:rPr>
+          <w:i/>
+          <w:iCs/>
+        </w:rPr>
+        <w:t xml:space="preserve"> </w:t>
+      </w:r>
+      <w:r>
+        <w:rPr>
+          <w:i/>
+          <w:iCs/>
+        </w:rPr>
+        <w:t xml:space="preserve">Co.</w:t>
+      </w:r>
+      <w:r>
+        <w:t xml:space="preserve">,</w:t>
+      </w:r>
+      <w:r>
+        <w:t xml:space="preserve"> </w:t>
+      </w:r>
+      <w:r>
+        <w:t xml:space="preserve">190</w:t>
+      </w:r>
+      <w:r>
+        <w:t xml:space="preserve"> </w:t>
+      </w:r>
+      <w:r>
+        <w:t xml:space="preserve">Ky.</w:t>
+      </w:r>
+      <w:r>
+        <w:t xml:space="preserve"> </w:t>
+      </w:r>
+      <w:r>
+        <w:t xml:space="preserve">7,</w:t>
+      </w:r>
+      <w:r>
+        <w:t xml:space="preserve"> </w:t>
+      </w:r>
+      <w:r>
+        <w:t xml:space="preserve">226</w:t>
+      </w:r>
+      <w:r>
+        <w:t xml:space="preserve"> </w:t>
+      </w:r>
+      <w:r>
+        <w:t xml:space="preserve">S.W.</w:t>
+      </w:r>
+      <w:r>
+        <w:t xml:space="preserve"> </w:t>
+      </w:r>
+      <w:r>
+        <w:t xml:space="preserve">102</w:t>
+      </w:r>
+      <w:r>
+        <w:t xml:space="preserve"> </w:t>
+      </w:r>
+      <w:r>
+        <w:t xml:space="preserve">(1920)</w:t>
+      </w:r>
+      <w:r>
+        <w:t xml:space="preserve">   </w:t>
       </w:r>
       <w:r>
         <w:tab/>
@@ -537,17 +2297,132 @@
     </w:p>
     <w:p>
       <w:pPr>
-        <w:pStyle w:val="TOAEntry"/>
-      </w:pPr>
-      <w:r>
-        <w:rPr>
-          <w:i/>
-          <w:iCs/>
-        </w:rPr>
-        <w:t xml:space="preserve">Solow v. Kalikow (In re Kalikow)</w:t>
-      </w:r>
-      <w:r>
-        <w:t xml:space="preserve">, 602 F.3d 82 (2d Cir. 2010)</w:t>
+        <w:pStyle w:val="BapLine"/>
+        <w:keepLines/>
+        <w:tabs>
+          <w:tab w:val="right" w:leader="dot" w:pos="9360"/>
+        </w:tabs>
+        <w:spacing w:before="140" w:after="0" w:line="364" w:lineRule="exact"/>
+        <w:ind w:left="720" w:right="1120" w:hanging="720"/>
+      </w:pPr>
+      <w:r>
+        <w:rPr>
+          <w:i/>
+          <w:iCs/>
+        </w:rPr>
+        <w:t xml:space="preserve">Solow</w:t>
+      </w:r>
+      <w:r>
+        <w:rPr>
+          <w:i/>
+          <w:iCs/>
+        </w:rPr>
+        <w:t xml:space="preserve"> </w:t>
+      </w:r>
+      <w:r>
+        <w:rPr>
+          <w:i/>
+          <w:iCs/>
+        </w:rPr>
+        <w:t xml:space="preserve">v.</w:t>
+      </w:r>
+      <w:r>
+        <w:rPr>
+          <w:i/>
+          <w:iCs/>
+        </w:rPr>
+        <w:t xml:space="preserve"> </w:t>
+      </w:r>
+      <w:r>
+        <w:rPr>
+          <w:i/>
+          <w:iCs/>
+        </w:rPr>
+        <w:t xml:space="preserve">Kalikow</w:t>
+      </w:r>
+      <w:r>
+        <w:rPr>
+          <w:i/>
+          <w:iCs/>
+        </w:rPr>
+        <w:t xml:space="preserve"> </w:t>
+      </w:r>
+      <w:r>
+        <w:rPr>
+          <w:i/>
+          <w:iCs/>
+        </w:rPr>
+        <w:t xml:space="preserve">(In</w:t>
+      </w:r>
+      <w:r>
+        <w:rPr>
+          <w:i/>
+          <w:iCs/>
+        </w:rPr>
+        <w:t xml:space="preserve"> </w:t>
+      </w:r>
+      <w:r>
+        <w:rPr>
+          <w:i/>
+          <w:iCs/>
+        </w:rPr>
+        <w:t xml:space="preserve">re</w:t>
+      </w:r>
+      <w:r>
+        <w:rPr>
+          <w:i/>
+          <w:iCs/>
+        </w:rPr>
+        <w:t xml:space="preserve"> </w:t>
+      </w:r>
+      <w:r>
+        <w:rPr>
+          <w:i/>
+          <w:iCs/>
+        </w:rPr>
+        <w:t xml:space="preserve">Kalikow)</w:t>
+      </w:r>
+      <w:r>
+        <w:t xml:space="preserve">,</w:t>
+      </w:r>
+      <w:r>
+        <w:t xml:space="preserve"> </w:t>
+      </w:r>
+      <w:r>
+        <w:t xml:space="preserve">602</w:t>
+      </w:r>
+      <w:r>
+        <w:t xml:space="preserve"> </w:t>
+      </w:r>
+      <w:r>
+        <w:t xml:space="preserve">F.3d</w:t>
+      </w:r>
+      <w:r>
+        <w:t xml:space="preserve"> </w:t>
+      </w:r>
+      <w:r>
+        <w:t xml:space="preserve">82</w:t>
+      </w:r>
+      <w:r>
+        <w:t xml:space="preserve"> </w:t>
+      </w:r>
+      <w:r>
+        <w:t xml:space="preserve">(2d</w:t>
+      </w:r>
+      <w:r>
+        <w:t xml:space="preserve"> </w:t>
+      </w:r>
+      <w:r>
+        <w:t xml:space="preserve">Cir.</w:t>
+      </w:r>
+      <w:r>
+        <w:t xml:space="preserve"> </w:t>
+      </w:r>
+      <w:r>
+        <w:t xml:space="preserve">2010)</w:t>
+      </w:r>
+      <w:r>
+        <w:t xml:space="preserve">   </w:t>
       </w:r>
       <w:r>
         <w:tab/>
@@ -558,21 +2433,30 @@
     </w:p>
     <w:p>
       <w:pPr>
-        <w:pStyle w:val="SectionEnd"/>
+        <w:spacing w:before="0" w:after="0" w:line="20" w:lineRule="exact"/>
         <w:sectPr>
-          <w:footerReference w:type="default" r:id="rIdFtrPage"/>
+          <w:footerReference w:type="default" r:id="rIdBapPage"/>
           <w:pgSz w:w="12240" w:h="15840"/>
           <w:pgMar w:top="1440" w:right="1440" w:bottom="1440" w:left="1440" w:header="720" w:footer="720" w:gutter="0"/>
           <w:pgNumType w:fmt="lowerRoman" w:start="1"/>
-          <w:cols w:space="720"/>
         </w:sectPr>
       </w:pPr>
     </w:p>
     <w:p>
       <w:pPr>
-        <w:pStyle w:val="Heading1Top"/>
-      </w:pPr>
-      <w:r>
+        <w:pStyle w:val="BapLine"/>
+        <w:keepNext/>
+        <w:keepLines/>
+        <w:spacing w:before="0" w:after="336" w:line="480" w:lineRule="exact"/>
+        <w:jc w:val="center"/>
+      </w:pPr>
+      <w:r>
+        <w:rPr>
+          <w:b/>
+          <w:bCs/>
+          <w:sz w:val="39"/>
+          <w:szCs w:val="39"/>
+        </w:rPr>
         <w:t xml:space="preserve">Introduction</w:t>
       </w:r>
     </w:p>
@@ -586,30 +2470,246 @@
     </w:p>
     <w:p>
       <w:pPr>
-        <w:pStyle w:val="Heading1"/>
-      </w:pPr>
-      <w:bookmarkStart w:id="9" w:name="_argument"/>
-      <w:r>
+        <w:pStyle w:val="BapLine"/>
+        <w:keepNext/>
+        <w:keepLines/>
+        <w:spacing w:before="448" w:after="336" w:line="480" w:lineRule="exact"/>
+        <w:jc w:val="center"/>
+      </w:pPr>
+      <w:r>
+        <w:rPr>
+          <w:b/>
+          <w:bCs/>
+          <w:sz w:val="39"/>
+          <w:szCs w:val="39"/>
+        </w:rPr>
         <w:t xml:space="preserve">Argument</w:t>
       </w:r>
-      <w:bookmarkEnd w:id="9"/>
-    </w:p>
-    <w:p>
-      <w:pPr>
-        <w:pStyle w:val="Heading2"/>
-      </w:pPr>
-      <w:bookmarkStart w:id="10" w:name="_36d11428c0297b0876f4d8a916538526ff0cbb2"/>
-      <w:r>
-        <w:t xml:space="preserve">I. If Affirmed, the Bankruptcy Court’s Opinion Would Hamper Future Bankruptcy Reorganizations.</w:t>
-      </w:r>
-      <w:bookmarkEnd w:id="10"/>
+    </w:p>
+    <w:p>
+      <w:pPr>
+        <w:pStyle w:val="BapLine"/>
+        <w:keepNext/>
+        <w:keepLines/>
+        <w:spacing w:before="336" w:after="280" w:line="400" w:lineRule="exact"/>
+      </w:pPr>
+      <w:r>
+        <w:rPr>
+          <w:b/>
+          <w:bCs/>
+          <w:sz w:val="34"/>
+          <w:szCs w:val="34"/>
+        </w:rPr>
+        <w:t xml:space="preserve">I.</w:t>
+      </w:r>
+      <w:r>
+        <w:rPr>
+          <w:b/>
+          <w:bCs/>
+          <w:sz w:val="34"/>
+          <w:szCs w:val="34"/>
+        </w:rPr>
+        <w:t xml:space="preserve"> </w:t>
+      </w:r>
+      <w:r>
+        <w:rPr>
+          <w:b/>
+          <w:bCs/>
+          <w:sz w:val="34"/>
+          <w:szCs w:val="34"/>
+        </w:rPr>
+        <w:t xml:space="preserve">If</w:t>
+      </w:r>
+      <w:r>
+        <w:rPr>
+          <w:b/>
+          <w:bCs/>
+          <w:sz w:val="34"/>
+          <w:szCs w:val="34"/>
+        </w:rPr>
+        <w:t xml:space="preserve"> </w:t>
+      </w:r>
+      <w:r>
+        <w:rPr>
+          <w:b/>
+          <w:bCs/>
+          <w:sz w:val="34"/>
+          <w:szCs w:val="34"/>
+        </w:rPr>
+        <w:t xml:space="preserve">Affirmed,</w:t>
+      </w:r>
+      <w:r>
+        <w:rPr>
+          <w:b/>
+          <w:bCs/>
+          <w:sz w:val="34"/>
+          <w:szCs w:val="34"/>
+        </w:rPr>
+        <w:t xml:space="preserve"> </w:t>
+      </w:r>
+      <w:r>
+        <w:rPr>
+          <w:b/>
+          <w:bCs/>
+          <w:sz w:val="34"/>
+          <w:szCs w:val="34"/>
+        </w:rPr>
+        <w:t xml:space="preserve">the</w:t>
+      </w:r>
+      <w:r>
+        <w:rPr>
+          <w:b/>
+          <w:bCs/>
+          <w:sz w:val="34"/>
+          <w:szCs w:val="34"/>
+        </w:rPr>
+        <w:t xml:space="preserve"> </w:t>
+      </w:r>
+      <w:r>
+        <w:rPr>
+          <w:b/>
+          <w:bCs/>
+          <w:sz w:val="34"/>
+          <w:szCs w:val="34"/>
+        </w:rPr>
+        <w:t xml:space="preserve">Bankruptcy</w:t>
+      </w:r>
+      <w:r>
+        <w:rPr>
+          <w:b/>
+          <w:bCs/>
+          <w:sz w:val="34"/>
+          <w:szCs w:val="34"/>
+        </w:rPr>
+        <w:t xml:space="preserve"> </w:t>
+      </w:r>
+      <w:r>
+        <w:rPr>
+          <w:b/>
+          <w:bCs/>
+          <w:sz w:val="34"/>
+          <w:szCs w:val="34"/>
+        </w:rPr>
+        <w:t xml:space="preserve">Court’s</w:t>
+      </w:r>
+      <w:r>
+        <w:rPr>
+          <w:b/>
+          <w:bCs/>
+          <w:sz w:val="34"/>
+          <w:szCs w:val="34"/>
+        </w:rPr>
+        <w:t xml:space="preserve"> </w:t>
+      </w:r>
+      <w:r>
+        <w:rPr>
+          <w:b/>
+          <w:bCs/>
+          <w:sz w:val="34"/>
+          <w:szCs w:val="34"/>
+        </w:rPr>
+        <w:t xml:space="preserve">Opinion</w:t>
+      </w:r>
+      <w:r>
+        <w:rPr>
+          <w:b/>
+          <w:bCs/>
+          <w:sz w:val="34"/>
+          <w:szCs w:val="34"/>
+        </w:rPr>
+        <w:t xml:space="preserve"> </w:t>
+      </w:r>
+      <w:r>
+        <w:rPr>
+          <w:b/>
+          <w:bCs/>
+          <w:sz w:val="34"/>
+          <w:szCs w:val="34"/>
+        </w:rPr>
+        <w:t xml:space="preserve">Would</w:t>
+      </w:r>
+      <w:r>
+        <w:rPr>
+          <w:b/>
+          <w:bCs/>
+          <w:sz w:val="34"/>
+          <w:szCs w:val="34"/>
+        </w:rPr>
+        <w:t xml:space="preserve"> </w:t>
+      </w:r>
+      <w:r>
+        <w:rPr>
+          <w:b/>
+          <w:bCs/>
+          <w:sz w:val="34"/>
+          <w:szCs w:val="34"/>
+        </w:rPr>
+        <w:t xml:space="preserve">Hamper</w:t>
+      </w:r>
+      <w:r>
+        <w:rPr>
+          <w:b/>
+          <w:bCs/>
+          <w:sz w:val="34"/>
+          <w:szCs w:val="34"/>
+        </w:rPr>
+        <w:t xml:space="preserve"> </w:t>
+      </w:r>
+      <w:r>
+        <w:rPr>
+          <w:b/>
+          <w:bCs/>
+          <w:sz w:val="34"/>
+          <w:szCs w:val="34"/>
+        </w:rPr>
+        <w:t xml:space="preserve">Future</w:t>
+      </w:r>
+      <w:r>
+        <w:rPr>
+          <w:b/>
+          <w:bCs/>
+          <w:sz w:val="34"/>
+          <w:szCs w:val="34"/>
+        </w:rPr>
+        <w:t xml:space="preserve"> </w:t>
+      </w:r>
+      <w:r>
+        <w:rPr>
+          <w:b/>
+          <w:bCs/>
+          <w:sz w:val="34"/>
+          <w:szCs w:val="34"/>
+        </w:rPr>
+        <w:t xml:space="preserve">Bankruptcy</w:t>
+      </w:r>
+      <w:r>
+        <w:rPr>
+          <w:b/>
+          <w:bCs/>
+          <w:sz w:val="34"/>
+          <w:szCs w:val="34"/>
+        </w:rPr>
+        <w:t xml:space="preserve"> </w:t>
+      </w:r>
+      <w:r>
+        <w:rPr>
+          <w:b/>
+          <w:bCs/>
+          <w:sz w:val="34"/>
+          <w:szCs w:val="34"/>
+        </w:rPr>
+        <w:t xml:space="preserve">Reorganizations.</w:t>
+      </w:r>
     </w:p>
     <w:p>
       <w:pPr>
         <w:pStyle w:val="FirstParagraph"/>
       </w:pPr>
       <w:r>
-        <w:t xml:space="preserve">Carve-out provisions are necessary to foster the reorganization process. See e.g. </w:t>
+        <w:t xml:space="preserve">Carve-out provisions are necessary to foster the reorganization process. See e.g.</w:t>
+      </w:r>
+      <w:r>
+        <w:t xml:space="preserve"> </w:t>
       </w:r>
       <w:r>
         <w:rPr>
@@ -692,13 +2792,218 @@
     </w:p>
     <w:p>
       <w:pPr>
-        <w:pStyle w:val="Heading2"/>
-      </w:pPr>
-      <w:bookmarkStart w:id="11" w:name="_e3999ceb0304185a07d2945284f9832d11d498f"/>
-      <w:r>
-        <w:t xml:space="preserve">II. The Cash Collateral Orders Subordinate UCB’s Liens to the Professionals’ Fees.</w:t>
-      </w:r>
-      <w:bookmarkEnd w:id="11"/>
+        <w:pStyle w:val="BapLine"/>
+        <w:keepNext/>
+        <w:keepLines/>
+        <w:spacing w:before="336" w:after="280" w:line="400" w:lineRule="exact"/>
+      </w:pPr>
+      <w:r>
+        <w:rPr>
+          <w:b/>
+          <w:bCs/>
+          <w:sz w:val="34"/>
+          <w:szCs w:val="34"/>
+        </w:rPr>
+        <w:t xml:space="preserve">II.</w:t>
+      </w:r>
+      <w:r>
+        <w:rPr>
+          <w:b/>
+          <w:bCs/>
+          <w:sz w:val="34"/>
+          <w:szCs w:val="34"/>
+        </w:rPr>
+        <w:t xml:space="preserve"> </w:t>
+      </w:r>
+      <w:r>
+        <w:rPr>
+          <w:b/>
+          <w:bCs/>
+          <w:sz w:val="34"/>
+          <w:szCs w:val="34"/>
+        </w:rPr>
+        <w:t xml:space="preserve">The</w:t>
+      </w:r>
+      <w:r>
+        <w:rPr>
+          <w:b/>
+          <w:bCs/>
+          <w:sz w:val="34"/>
+          <w:szCs w:val="34"/>
+        </w:rPr>
+        <w:t xml:space="preserve"> </w:t>
+      </w:r>
+      <w:r>
+        <w:rPr>
+          <w:b/>
+          <w:bCs/>
+          <w:sz w:val="34"/>
+          <w:szCs w:val="34"/>
+        </w:rPr>
+        <w:t xml:space="preserve">Cash</w:t>
+      </w:r>
+      <w:r>
+        <w:rPr>
+          <w:b/>
+          <w:bCs/>
+          <w:sz w:val="34"/>
+          <w:szCs w:val="34"/>
+        </w:rPr>
+        <w:t xml:space="preserve"> </w:t>
+      </w:r>
+      <w:r>
+        <w:rPr>
+          <w:b/>
+          <w:bCs/>
+          <w:sz w:val="34"/>
+          <w:szCs w:val="34"/>
+        </w:rPr>
+        <w:t xml:space="preserve">Collateral</w:t>
+      </w:r>
+      <w:r>
+        <w:rPr>
+          <w:b/>
+          <w:bCs/>
+          <w:sz w:val="34"/>
+          <w:szCs w:val="34"/>
+        </w:rPr>
+        <w:t xml:space="preserve"> </w:t>
+      </w:r>
+      <w:r>
+        <w:rPr>
+          <w:b/>
+          <w:bCs/>
+          <w:sz w:val="34"/>
+          <w:szCs w:val="34"/>
+        </w:rPr>
+        <w:t xml:space="preserve">Orders</w:t>
+      </w:r>
+      <w:r>
+        <w:rPr>
+          <w:b/>
+          <w:bCs/>
+          <w:sz w:val="34"/>
+          <w:szCs w:val="34"/>
+        </w:rPr>
+        <w:t xml:space="preserve"> </w:t>
+      </w:r>
+      <w:r>
+        <w:rPr>
+          <w:b/>
+          <w:bCs/>
+          <w:sz w:val="34"/>
+          <w:szCs w:val="34"/>
+        </w:rPr>
+        <w:t xml:space="preserve">Subordinate</w:t>
+      </w:r>
+      <w:r>
+        <w:rPr>
+          <w:b/>
+          <w:bCs/>
+          <w:sz w:val="34"/>
+          <w:szCs w:val="34"/>
+        </w:rPr>
+        <w:t xml:space="preserve"> </w:t>
+      </w:r>
+      <w:r>
+        <w:rPr>
+          <w:b/>
+          <w:bCs/>
+          <w:sz w:val="34"/>
+          <w:szCs w:val="34"/>
+        </w:rPr>
+        <w:t xml:space="preserve">UCB’s</w:t>
+      </w:r>
+      <w:r>
+        <w:rPr>
+          <w:b/>
+          <w:bCs/>
+          <w:sz w:val="34"/>
+          <w:szCs w:val="34"/>
+        </w:rPr>
+        <w:t xml:space="preserve"> </w:t>
+      </w:r>
+      <w:r>
+        <w:rPr>
+          <w:b/>
+          <w:bCs/>
+          <w:sz w:val="34"/>
+          <w:szCs w:val="34"/>
+        </w:rPr>
+        <w:t xml:space="preserve">Liens</w:t>
+      </w:r>
+      <w:r>
+        <w:rPr>
+          <w:b/>
+          <w:bCs/>
+          <w:sz w:val="34"/>
+          <w:szCs w:val="34"/>
+        </w:rPr>
+        <w:t xml:space="preserve"> </w:t>
+      </w:r>
+      <w:r>
+        <w:rPr>
+          <w:b/>
+          <w:bCs/>
+          <w:sz w:val="34"/>
+          <w:szCs w:val="34"/>
+        </w:rPr>
+        <w:t xml:space="preserve">to</w:t>
+      </w:r>
+      <w:r>
+        <w:rPr>
+          <w:b/>
+          <w:bCs/>
+          <w:sz w:val="34"/>
+          <w:szCs w:val="34"/>
+        </w:rPr>
+        <w:t xml:space="preserve"> </w:t>
+      </w:r>
+      <w:r>
+        <w:rPr>
+          <w:b/>
+          <w:bCs/>
+          <w:sz w:val="34"/>
+          <w:szCs w:val="34"/>
+        </w:rPr>
+        <w:t xml:space="preserve">the</w:t>
+      </w:r>
+      <w:r>
+        <w:rPr>
+          <w:b/>
+          <w:bCs/>
+          <w:sz w:val="34"/>
+          <w:szCs w:val="34"/>
+        </w:rPr>
+        <w:t xml:space="preserve"> </w:t>
+      </w:r>
+      <w:r>
+        <w:rPr>
+          <w:b/>
+          <w:bCs/>
+          <w:sz w:val="34"/>
+          <w:szCs w:val="34"/>
+        </w:rPr>
+        <w:t xml:space="preserve">Professionals’</w:t>
+      </w:r>
+      <w:r>
+        <w:rPr>
+          <w:b/>
+          <w:bCs/>
+          <w:sz w:val="34"/>
+          <w:szCs w:val="34"/>
+        </w:rPr>
+        <w:t xml:space="preserve"> </w:t>
+      </w:r>
+      <w:r>
+        <w:rPr>
+          <w:b/>
+          <w:bCs/>
+          <w:sz w:val="34"/>
+          <w:szCs w:val="34"/>
+        </w:rPr>
+        <w:t xml:space="preserve">Fees.</w:t>
+      </w:r>
     </w:p>
     <w:p>
       <w:pPr>
@@ -718,23 +3023,304 @@
     </w:p>
     <w:p>
       <w:pPr>
-        <w:pStyle w:val="Heading2"/>
-      </w:pPr>
-      <w:bookmarkStart w:id="12" w:name="_3279d3ccd6b5f91e5156fd88c79a9a49a94d3b5"/>
-      <w:r>
-        <w:t xml:space="preserve">III. The Plan of Reorganization Affirms the Professionals’ Rights to the Carve-Out.</w:t>
-      </w:r>
-      <w:bookmarkEnd w:id="12"/>
-    </w:p>
-    <w:p>
-      <w:pPr>
-        <w:pStyle w:val="Heading3"/>
-      </w:pPr>
-      <w:bookmarkStart w:id="13" w:name="_fc73c314a2ef90e6c9949594e63f544488b5a81"/>
-      <w:r>
-        <w:t xml:space="preserve">A. The Plan Retains The Carve-Out.</w:t>
-      </w:r>
-      <w:bookmarkEnd w:id="13"/>
+        <w:pStyle w:val="BapLine"/>
+        <w:keepNext/>
+        <w:keepLines/>
+        <w:spacing w:before="336" w:after="280" w:line="400" w:lineRule="exact"/>
+      </w:pPr>
+      <w:r>
+        <w:rPr>
+          <w:b/>
+          <w:bCs/>
+          <w:sz w:val="34"/>
+          <w:szCs w:val="34"/>
+        </w:rPr>
+        <w:t xml:space="preserve">III.</w:t>
+      </w:r>
+      <w:r>
+        <w:rPr>
+          <w:b/>
+          <w:bCs/>
+          <w:sz w:val="34"/>
+          <w:szCs w:val="34"/>
+        </w:rPr>
+        <w:t xml:space="preserve"> </w:t>
+      </w:r>
+      <w:r>
+        <w:rPr>
+          <w:b/>
+          <w:bCs/>
+          <w:sz w:val="34"/>
+          <w:szCs w:val="34"/>
+        </w:rPr>
+        <w:t xml:space="preserve">The</w:t>
+      </w:r>
+      <w:r>
+        <w:rPr>
+          <w:b/>
+          <w:bCs/>
+          <w:sz w:val="34"/>
+          <w:szCs w:val="34"/>
+        </w:rPr>
+        <w:t xml:space="preserve"> </w:t>
+      </w:r>
+      <w:r>
+        <w:rPr>
+          <w:b/>
+          <w:bCs/>
+          <w:sz w:val="34"/>
+          <w:szCs w:val="34"/>
+        </w:rPr>
+        <w:t xml:space="preserve">Plan</w:t>
+      </w:r>
+      <w:r>
+        <w:rPr>
+          <w:b/>
+          <w:bCs/>
+          <w:sz w:val="34"/>
+          <w:szCs w:val="34"/>
+        </w:rPr>
+        <w:t xml:space="preserve"> </w:t>
+      </w:r>
+      <w:r>
+        <w:rPr>
+          <w:b/>
+          <w:bCs/>
+          <w:sz w:val="34"/>
+          <w:szCs w:val="34"/>
+        </w:rPr>
+        <w:t xml:space="preserve">of</w:t>
+      </w:r>
+      <w:r>
+        <w:rPr>
+          <w:b/>
+          <w:bCs/>
+          <w:sz w:val="34"/>
+          <w:szCs w:val="34"/>
+        </w:rPr>
+        <w:t xml:space="preserve"> </w:t>
+      </w:r>
+      <w:r>
+        <w:rPr>
+          <w:b/>
+          <w:bCs/>
+          <w:sz w:val="34"/>
+          <w:szCs w:val="34"/>
+        </w:rPr>
+        <w:t xml:space="preserve">Reorganization</w:t>
+      </w:r>
+      <w:r>
+        <w:rPr>
+          <w:b/>
+          <w:bCs/>
+          <w:sz w:val="34"/>
+          <w:szCs w:val="34"/>
+        </w:rPr>
+        <w:t xml:space="preserve"> </w:t>
+      </w:r>
+      <w:r>
+        <w:rPr>
+          <w:b/>
+          <w:bCs/>
+          <w:sz w:val="34"/>
+          <w:szCs w:val="34"/>
+        </w:rPr>
+        <w:t xml:space="preserve">Affirms</w:t>
+      </w:r>
+      <w:r>
+        <w:rPr>
+          <w:b/>
+          <w:bCs/>
+          <w:sz w:val="34"/>
+          <w:szCs w:val="34"/>
+        </w:rPr>
+        <w:t xml:space="preserve"> </w:t>
+      </w:r>
+      <w:r>
+        <w:rPr>
+          <w:b/>
+          <w:bCs/>
+          <w:sz w:val="34"/>
+          <w:szCs w:val="34"/>
+        </w:rPr>
+        <w:t xml:space="preserve">the</w:t>
+      </w:r>
+      <w:r>
+        <w:rPr>
+          <w:b/>
+          <w:bCs/>
+          <w:sz w:val="34"/>
+          <w:szCs w:val="34"/>
+        </w:rPr>
+        <w:t xml:space="preserve"> </w:t>
+      </w:r>
+      <w:r>
+        <w:rPr>
+          <w:b/>
+          <w:bCs/>
+          <w:sz w:val="34"/>
+          <w:szCs w:val="34"/>
+        </w:rPr>
+        <w:t xml:space="preserve">Professionals’</w:t>
+      </w:r>
+      <w:r>
+        <w:rPr>
+          <w:b/>
+          <w:bCs/>
+          <w:sz w:val="34"/>
+          <w:szCs w:val="34"/>
+        </w:rPr>
+        <w:t xml:space="preserve"> </w:t>
+      </w:r>
+      <w:r>
+        <w:rPr>
+          <w:b/>
+          <w:bCs/>
+          <w:sz w:val="34"/>
+          <w:szCs w:val="34"/>
+        </w:rPr>
+        <w:t xml:space="preserve">Rights</w:t>
+      </w:r>
+      <w:r>
+        <w:rPr>
+          <w:b/>
+          <w:bCs/>
+          <w:sz w:val="34"/>
+          <w:szCs w:val="34"/>
+        </w:rPr>
+        <w:t xml:space="preserve"> </w:t>
+      </w:r>
+      <w:r>
+        <w:rPr>
+          <w:b/>
+          <w:bCs/>
+          <w:sz w:val="34"/>
+          <w:szCs w:val="34"/>
+        </w:rPr>
+        <w:t xml:space="preserve">to</w:t>
+      </w:r>
+      <w:r>
+        <w:rPr>
+          <w:b/>
+          <w:bCs/>
+          <w:sz w:val="34"/>
+          <w:szCs w:val="34"/>
+        </w:rPr>
+        <w:t xml:space="preserve"> </w:t>
+      </w:r>
+      <w:r>
+        <w:rPr>
+          <w:b/>
+          <w:bCs/>
+          <w:sz w:val="34"/>
+          <w:szCs w:val="34"/>
+        </w:rPr>
+        <w:t xml:space="preserve">the</w:t>
+      </w:r>
+      <w:r>
+        <w:rPr>
+          <w:b/>
+          <w:bCs/>
+          <w:sz w:val="34"/>
+          <w:szCs w:val="34"/>
+        </w:rPr>
+        <w:t xml:space="preserve"> </w:t>
+      </w:r>
+      <w:r>
+        <w:rPr>
+          <w:b/>
+          <w:bCs/>
+          <w:sz w:val="34"/>
+          <w:szCs w:val="34"/>
+        </w:rPr>
+        <w:t xml:space="preserve">Carve-Out.</w:t>
+      </w:r>
+    </w:p>
+    <w:p>
+      <w:pPr>
+        <w:pStyle w:val="BapLine"/>
+        <w:keepNext/>
+        <w:keepLines/>
+        <w:spacing w:before="308" w:after="280" w:line="364" w:lineRule="exact"/>
+        <w:ind w:left="720"/>
+      </w:pPr>
+      <w:r>
+        <w:rPr>
+          <w:b/>
+          <w:bCs/>
+        </w:rPr>
+        <w:t xml:space="preserve">A.</w:t>
+      </w:r>
+      <w:r>
+        <w:rPr>
+          <w:b/>
+          <w:bCs/>
+        </w:rPr>
+        <w:t xml:space="preserve"> </w:t>
+      </w:r>
+      <w:r>
+        <w:rPr>
+          <w:b/>
+          <w:bCs/>
+        </w:rPr>
+        <w:t xml:space="preserve">The</w:t>
+      </w:r>
+      <w:r>
+        <w:rPr>
+          <w:b/>
+          <w:bCs/>
+        </w:rPr>
+        <w:t xml:space="preserve"> </w:t>
+      </w:r>
+      <w:r>
+        <w:rPr>
+          <w:b/>
+          <w:bCs/>
+        </w:rPr>
+        <w:t xml:space="preserve">Plan</w:t>
+      </w:r>
+      <w:r>
+        <w:rPr>
+          <w:b/>
+          <w:bCs/>
+        </w:rPr>
+        <w:t xml:space="preserve"> </w:t>
+      </w:r>
+      <w:r>
+        <w:rPr>
+          <w:b/>
+          <w:bCs/>
+        </w:rPr>
+        <w:t xml:space="preserve">Retains</w:t>
+      </w:r>
+      <w:r>
+        <w:rPr>
+          <w:b/>
+          <w:bCs/>
+        </w:rPr>
+        <w:t xml:space="preserve"> </w:t>
+      </w:r>
+      <w:r>
+        <w:rPr>
+          <w:b/>
+          <w:bCs/>
+        </w:rPr>
+        <w:t xml:space="preserve">The</w:t>
+      </w:r>
+      <w:r>
+        <w:rPr>
+          <w:b/>
+          <w:bCs/>
+        </w:rPr>
+        <w:t xml:space="preserve"> </w:t>
+      </w:r>
+      <w:r>
+        <w:rPr>
+          <w:b/>
+          <w:bCs/>
+        </w:rPr>
+        <w:t xml:space="preserve">Carve-Out.</w:t>
+      </w:r>
     </w:p>
     <w:p>
       <w:pPr>
@@ -751,7 +3337,7 @@
           <w:i/>
           <w:iCs/>
         </w:rPr>
-        <w:t xml:space="preserve">Denver &amp; R.G. W. R. Co. v. Goldman, Sachs &amp; Co.</w:t>
+        <w:t xml:space="preserve">Denver &amp; R.G. W. R. Co. v. Goldman, Sachs &amp; Co.</w:t>
       </w:r>
       <w:r>
         <w:t xml:space="preserve">, 212 F.2d 627, 630 (10th Cir. 1954). The confirmed plan “becomes a binding contract between debtor and its creditors and is to be interpreted in accordance with general contract law.”</w:t>
@@ -788,13 +3374,187 @@
     </w:p>
     <w:p>
       <w:pPr>
-        <w:pStyle w:val="Heading3"/>
-      </w:pPr>
-      <w:bookmarkStart w:id="14" w:name="_9aa6619c08eb2cde73ecd9a366bf71933f18a58"/>
-      <w:r>
-        <w:t xml:space="preserve">B. The Professionals Did Not Release UCB From Its Obligations Under The Carve-Out.</w:t>
-      </w:r>
-      <w:bookmarkEnd w:id="14"/>
+        <w:pStyle w:val="BapLine"/>
+        <w:keepNext/>
+        <w:keepLines/>
+        <w:spacing w:before="308" w:after="280" w:line="364" w:lineRule="exact"/>
+        <w:ind w:left="720"/>
+      </w:pPr>
+      <w:r>
+        <w:rPr>
+          <w:b/>
+          <w:bCs/>
+        </w:rPr>
+        <w:t xml:space="preserve">B.</w:t>
+      </w:r>
+      <w:r>
+        <w:rPr>
+          <w:b/>
+          <w:bCs/>
+        </w:rPr>
+        <w:t xml:space="preserve"> </w:t>
+      </w:r>
+      <w:r>
+        <w:rPr>
+          <w:b/>
+          <w:bCs/>
+        </w:rPr>
+        <w:t xml:space="preserve">The</w:t>
+      </w:r>
+      <w:r>
+        <w:rPr>
+          <w:b/>
+          <w:bCs/>
+        </w:rPr>
+        <w:t xml:space="preserve"> </w:t>
+      </w:r>
+      <w:r>
+        <w:rPr>
+          <w:b/>
+          <w:bCs/>
+        </w:rPr>
+        <w:t xml:space="preserve">Professionals</w:t>
+      </w:r>
+      <w:r>
+        <w:rPr>
+          <w:b/>
+          <w:bCs/>
+        </w:rPr>
+        <w:t xml:space="preserve"> </w:t>
+      </w:r>
+      <w:r>
+        <w:rPr>
+          <w:b/>
+          <w:bCs/>
+        </w:rPr>
+        <w:t xml:space="preserve">Did</w:t>
+      </w:r>
+      <w:r>
+        <w:rPr>
+          <w:b/>
+          <w:bCs/>
+        </w:rPr>
+        <w:t xml:space="preserve"> </w:t>
+      </w:r>
+      <w:r>
+        <w:rPr>
+          <w:b/>
+          <w:bCs/>
+        </w:rPr>
+        <w:t xml:space="preserve">Not</w:t>
+      </w:r>
+      <w:r>
+        <w:rPr>
+          <w:b/>
+          <w:bCs/>
+        </w:rPr>
+        <w:t xml:space="preserve"> </w:t>
+      </w:r>
+      <w:r>
+        <w:rPr>
+          <w:b/>
+          <w:bCs/>
+        </w:rPr>
+        <w:t xml:space="preserve">Release</w:t>
+      </w:r>
+      <w:r>
+        <w:rPr>
+          <w:b/>
+          <w:bCs/>
+        </w:rPr>
+        <w:t xml:space="preserve"> </w:t>
+      </w:r>
+      <w:r>
+        <w:rPr>
+          <w:b/>
+          <w:bCs/>
+        </w:rPr>
+        <w:t xml:space="preserve">UCB</w:t>
+      </w:r>
+      <w:r>
+        <w:rPr>
+          <w:b/>
+          <w:bCs/>
+        </w:rPr>
+        <w:t xml:space="preserve"> </w:t>
+      </w:r>
+      <w:r>
+        <w:rPr>
+          <w:b/>
+          <w:bCs/>
+        </w:rPr>
+        <w:t xml:space="preserve">From</w:t>
+      </w:r>
+      <w:r>
+        <w:rPr>
+          <w:b/>
+          <w:bCs/>
+        </w:rPr>
+        <w:t xml:space="preserve"> </w:t>
+      </w:r>
+      <w:r>
+        <w:rPr>
+          <w:b/>
+          <w:bCs/>
+        </w:rPr>
+        <w:t xml:space="preserve">Its</w:t>
+      </w:r>
+      <w:r>
+        <w:rPr>
+          <w:b/>
+          <w:bCs/>
+        </w:rPr>
+        <w:t xml:space="preserve"> </w:t>
+      </w:r>
+      <w:r>
+        <w:rPr>
+          <w:b/>
+          <w:bCs/>
+        </w:rPr>
+        <w:t xml:space="preserve">Obligations</w:t>
+      </w:r>
+      <w:r>
+        <w:rPr>
+          <w:b/>
+          <w:bCs/>
+        </w:rPr>
+        <w:t xml:space="preserve"> </w:t>
+      </w:r>
+      <w:r>
+        <w:rPr>
+          <w:b/>
+          <w:bCs/>
+        </w:rPr>
+        <w:t xml:space="preserve">Under</w:t>
+      </w:r>
+      <w:r>
+        <w:rPr>
+          <w:b/>
+          <w:bCs/>
+        </w:rPr>
+        <w:t xml:space="preserve"> </w:t>
+      </w:r>
+      <w:r>
+        <w:rPr>
+          <w:b/>
+          <w:bCs/>
+        </w:rPr>
+        <w:t xml:space="preserve">The</w:t>
+      </w:r>
+      <w:r>
+        <w:rPr>
+          <w:b/>
+          <w:bCs/>
+        </w:rPr>
+        <w:t xml:space="preserve"> </w:t>
+      </w:r>
+      <w:r>
+        <w:rPr>
+          <w:b/>
+          <w:bCs/>
+        </w:rPr>
+        <w:t xml:space="preserve">Carve-Out.</w:t>
+      </w:r>
     </w:p>
     <w:p>
       <w:pPr>
@@ -824,7 +3584,7 @@
           <w:i/>
           <w:iCs/>
         </w:rPr>
-        <w:t xml:space="preserve">Louisville Water Co. v. Wells</w:t>
+        <w:t xml:space="preserve">Louisville Water Co. v. Wells</w:t>
       </w:r>
       <w:r>
         <w:t xml:space="preserve">, 664 S.W.2d 525 (Ky. App. 1984)) (“As a general rule of statutory construction, expressio unius est exclusio alterius provides that an enumeration of a particular thing demonstrates that the omission of another thing is an intentional exclusion.”).</w:t>
@@ -832,13 +3592,21 @@
     </w:p>
     <w:p>
       <w:pPr>
-        <w:pStyle w:val="Heading1"/>
-      </w:pPr>
-      <w:bookmarkStart w:id="15" w:name="_conclusion"/>
-      <w:r>
+        <w:pStyle w:val="BapLine"/>
+        <w:keepNext/>
+        <w:keepLines/>
+        <w:spacing w:before="448" w:after="336" w:line="480" w:lineRule="exact"/>
+        <w:jc w:val="center"/>
+      </w:pPr>
+      <w:r>
+        <w:rPr>
+          <w:b/>
+          <w:bCs/>
+          <w:sz w:val="39"/>
+          <w:szCs w:val="39"/>
+        </w:rPr>
         <w:t xml:space="preserve">Conclusion</w:t>
       </w:r>
-      <w:bookmarkEnd w:id="15"/>
     </w:p>
     <w:p>
       <w:pPr>
@@ -850,7 +3618,11 @@
     </w:p>
     <w:p>
       <w:pPr>
-        <w:pStyle w:val="SignatureLead"/>
+        <w:pStyle w:val="BapLine"/>
+        <w:keepNext/>
+        <w:keepLines/>
+        <w:spacing w:before="448" w:after="0" w:line="364" w:lineRule="exact"/>
+        <w:ind w:left="4680"/>
       </w:pPr>
       <w:r>
         <w:t xml:space="preserve">Respectfully submitted,</w:t>
@@ -858,7 +3630,11 @@
     </w:p>
     <w:p>
       <w:pPr>
-        <w:pStyle w:val="Signature"/>
+        <w:pStyle w:val="BapLine"/>
+        <w:keepNext/>
+        <w:keepLines/>
+        <w:spacing w:before="336" w:after="0" w:line="364" w:lineRule="exact"/>
+        <w:ind w:left="4680"/>
       </w:pPr>
       <w:r>
         <w:t xml:space="preserve">s/ Kyle W. Miller</w:t>
@@ -866,15 +3642,41 @@
     </w:p>
     <w:p>
       <w:pPr>
-        <w:pStyle w:val="Signature"/>
-      </w:pPr>
-      <w:r>
-        <w:t xml:space="preserve">BINGHAM GREENEBAUM DOLL LLP</w:t>
-      </w:r>
-    </w:p>
-    <w:p>
-      <w:pPr>
-        <w:pStyle w:val="Signature"/>
+        <w:pStyle w:val="BapLine"/>
+        <w:keepNext/>
+        <w:keepLines/>
+        <w:spacing w:before="0" w:after="0" w:line="364" w:lineRule="exact"/>
+        <w:ind w:left="4680"/>
+      </w:pPr>
+      <w:r>
+        <w:t xml:space="preserve">BINGHAM</w:t>
+      </w:r>
+      <w:r>
+        <w:t xml:space="preserve"> </w:t>
+      </w:r>
+      <w:r>
+        <w:t xml:space="preserve">GREENEBAUM</w:t>
+      </w:r>
+      <w:r>
+        <w:t xml:space="preserve"> </w:t>
+      </w:r>
+      <w:r>
+        <w:t xml:space="preserve">DOLL</w:t>
+      </w:r>
+      <w:r>
+        <w:t xml:space="preserve"> </w:t>
+      </w:r>
+      <w:r>
+        <w:t xml:space="preserve">LLP</w:t>
+      </w:r>
+    </w:p>
+    <w:p>
+      <w:pPr>
+        <w:pStyle w:val="BapLine"/>
+        <w:keepNext/>
+        <w:keepLines/>
+        <w:spacing w:before="0" w:after="0" w:line="364" w:lineRule="exact"/>
+        <w:ind w:left="4680"/>
       </w:pPr>
       <w:r>
         <w:t xml:space="preserve">kmiller@bgdlegal.com</w:t>
@@ -882,23 +3684,52 @@
     </w:p>
     <w:p>
       <w:pPr>
-        <w:pStyle w:val="SignatureDate"/>
-      </w:pPr>
-      <w:r>
-        <w:t xml:space="preserve">September 12, 2019</w:t>
-      </w:r>
-    </w:p>
-    <w:p>
-      <w:pPr>
-        <w:pStyle w:val="FrontHeadingBreak"/>
-      </w:pPr>
-      <w:r>
+        <w:pStyle w:val="BapLine"/>
+        <w:keepLines/>
+        <w:spacing w:before="224" w:after="0" w:line="364" w:lineRule="exact"/>
+        <w:ind w:left="4680"/>
+      </w:pPr>
+      <w:r>
+        <w:t xml:space="preserve">September</w:t>
+      </w:r>
+      <w:r>
+        <w:t xml:space="preserve"> </w:t>
+      </w:r>
+      <w:r>
+        <w:t xml:space="preserve">12,</w:t>
+      </w:r>
+      <w:r>
+        <w:t xml:space="preserve"> </w:t>
+      </w:r>
+      <w:r>
+        <w:t xml:space="preserve">2019</w:t>
+      </w:r>
+    </w:p>
+    <w:p>
+      <w:pPr>
+        <w:pStyle w:val="BapLine"/>
+        <w:keepNext/>
+        <w:keepLines/>
+        <w:pageBreakBefore/>
+        <w:spacing w:before="0" w:after="336" w:line="480" w:lineRule="exact"/>
+        <w:jc w:val="center"/>
+      </w:pPr>
+      <w:r>
+        <w:rPr>
+          <w:b/>
+          <w:bCs/>
+          <w:sz w:val="39"/>
+          <w:szCs w:val="39"/>
+        </w:rPr>
         <w:t xml:space="preserve">Certificate of Compliance</w:t>
       </w:r>
     </w:p>
     <w:p>
       <w:pPr>
-        <w:pStyle w:val="CertText"/>
+        <w:pStyle w:val="BapLine"/>
+        <w:keepNext/>
+        <w:keepLines/>
+        <w:spacing w:before="0" w:after="0" w:line="364" w:lineRule="exact"/>
       </w:pPr>
       <w:r>
         <w:t xml:space="preserve">This reply brief of appellant complies with the type-volume limitation of Fed. R. Bankr. P. 8015(a)(7)(B) because it contains 970 words, excluding the parts of the brief exempted by Fed. R. Bankr. P. 8015(g). It complies with the typeface requirement of Fed. R. Bankr. P. 8015(a)(5) and the type-style requirement of Fed. R. Bankr. P. 8015(a)(6) because it was prepared in a proportionally spaced typeface, Times New Roman at 14-point, with case names in italics.</w:t>
@@ -906,7 +3737,11 @@
     </w:p>
     <w:p>
       <w:pPr>
-        <w:pStyle w:val="SignatureLead"/>
+        <w:pStyle w:val="BapLine"/>
+        <w:keepNext/>
+        <w:keepLines/>
+        <w:spacing w:before="448" w:after="0" w:line="364" w:lineRule="exact"/>
+        <w:ind w:left="4680"/>
       </w:pPr>
       <w:r>
         <w:t xml:space="preserve">Respectfully submitted,</w:t>
@@ -914,7 +3749,11 @@
     </w:p>
     <w:p>
       <w:pPr>
-        <w:pStyle w:val="Signature"/>
+        <w:pStyle w:val="BapLine"/>
+        <w:keepNext/>
+        <w:keepLines/>
+        <w:spacing w:before="336" w:after="0" w:line="364" w:lineRule="exact"/>
+        <w:ind w:left="4680"/>
       </w:pPr>
       <w:r>
         <w:t xml:space="preserve">s/ Kyle W. Miller</w:t>
@@ -922,15 +3761,41 @@
     </w:p>
     <w:p>
       <w:pPr>
-        <w:pStyle w:val="Signature"/>
-      </w:pPr>
-      <w:r>
-        <w:t xml:space="preserve">BINGHAM GREENEBAUM DOLL LLP</w:t>
-      </w:r>
-    </w:p>
-    <w:p>
-      <w:pPr>
-        <w:pStyle w:val="Signature"/>
+        <w:pStyle w:val="BapLine"/>
+        <w:keepNext/>
+        <w:keepLines/>
+        <w:spacing w:before="0" w:after="0" w:line="364" w:lineRule="exact"/>
+        <w:ind w:left="4680"/>
+      </w:pPr>
+      <w:r>
+        <w:t xml:space="preserve">BINGHAM</w:t>
+      </w:r>
+      <w:r>
+        <w:t xml:space="preserve"> </w:t>
+      </w:r>
+      <w:r>
+        <w:t xml:space="preserve">GREENEBAUM</w:t>
+      </w:r>
+      <w:r>
+        <w:t xml:space="preserve"> </w:t>
+      </w:r>
+      <w:r>
+        <w:t xml:space="preserve">DOLL</w:t>
+      </w:r>
+      <w:r>
+        <w:t xml:space="preserve"> </w:t>
+      </w:r>
+      <w:r>
+        <w:t xml:space="preserve">LLP</w:t>
+      </w:r>
+    </w:p>
+    <w:p>
+      <w:pPr>
+        <w:pStyle w:val="BapLine"/>
+        <w:keepNext/>
+        <w:keepLines/>
+        <w:spacing w:before="0" w:after="0" w:line="364" w:lineRule="exact"/>
+        <w:ind w:left="4680"/>
       </w:pPr>
       <w:r>
         <w:t xml:space="preserve">kmiller@bgdlegal.com</w:t>
@@ -938,23 +3803,51 @@
     </w:p>
     <w:p>
       <w:pPr>
-        <w:pStyle w:val="SignatureDate"/>
-      </w:pPr>
-      <w:r>
-        <w:t xml:space="preserve">September 12, 2019</w:t>
-      </w:r>
-    </w:p>
-    <w:p>
-      <w:pPr>
-        <w:pStyle w:val="CertHeading"/>
-      </w:pPr>
-      <w:r>
+        <w:pStyle w:val="BapLine"/>
+        <w:keepLines/>
+        <w:spacing w:before="224" w:after="0" w:line="364" w:lineRule="exact"/>
+        <w:ind w:left="4680"/>
+      </w:pPr>
+      <w:r>
+        <w:t xml:space="preserve">September</w:t>
+      </w:r>
+      <w:r>
+        <w:t xml:space="preserve"> </w:t>
+      </w:r>
+      <w:r>
+        <w:t xml:space="preserve">12,</w:t>
+      </w:r>
+      <w:r>
+        <w:t xml:space="preserve"> </w:t>
+      </w:r>
+      <w:r>
+        <w:t xml:space="preserve">2019</w:t>
+      </w:r>
+    </w:p>
+    <w:p>
+      <w:pPr>
+        <w:pStyle w:val="BapLine"/>
+        <w:keepNext/>
+        <w:keepLines/>
+        <w:spacing w:before="448" w:after="336" w:line="480" w:lineRule="exact"/>
+        <w:jc w:val="center"/>
+      </w:pPr>
+      <w:r>
+        <w:rPr>
+          <w:b/>
+          <w:bCs/>
+          <w:sz w:val="39"/>
+          <w:szCs w:val="39"/>
+        </w:rPr>
         <w:t xml:space="preserve">Certificate of Service</w:t>
       </w:r>
     </w:p>
     <w:p>
       <w:pPr>
-        <w:pStyle w:val="CertText"/>
+        <w:pStyle w:val="BapLine"/>
+        <w:keepNext/>
+        <w:keepLines/>
+        <w:spacing w:before="0" w:after="0" w:line="364" w:lineRule="exact"/>
       </w:pPr>
       <w:r>
         <w:t xml:space="preserve">I certify that on September 12, 2019 I filed this reply brief of appellant with the Clerk of the Bankruptcy Appellate Panel of the Sixth Circuit through the court’s electronic filing system, which will send notice of the filing to all counsel of record.</w:t>
@@ -962,7 +3855,11 @@
     </w:p>
     <w:p>
       <w:pPr>
-        <w:pStyle w:val="SignatureLead"/>
+        <w:pStyle w:val="BapLine"/>
+        <w:keepNext/>
+        <w:keepLines/>
+        <w:spacing w:before="448" w:after="0" w:line="364" w:lineRule="exact"/>
+        <w:ind w:left="4680"/>
       </w:pPr>
       <w:r>
         <w:t xml:space="preserve">Respectfully submitted,</w:t>
@@ -970,7 +3867,11 @@
     </w:p>
     <w:p>
       <w:pPr>
-        <w:pStyle w:val="Signature"/>
+        <w:pStyle w:val="BapLine"/>
+        <w:keepNext/>
+        <w:keepLines/>
+        <w:spacing w:before="336" w:after="0" w:line="364" w:lineRule="exact"/>
+        <w:ind w:left="4680"/>
       </w:pPr>
       <w:r>
         <w:t xml:space="preserve">s/ Kyle W. Miller</w:t>
@@ -978,15 +3879,41 @@
     </w:p>
     <w:p>
       <w:pPr>
-        <w:pStyle w:val="Signature"/>
-      </w:pPr>
-      <w:r>
-        <w:t xml:space="preserve">BINGHAM GREENEBAUM DOLL LLP</w:t>
-      </w:r>
-    </w:p>
-    <w:p>
-      <w:pPr>
-        <w:pStyle w:val="Signature"/>
+        <w:pStyle w:val="BapLine"/>
+        <w:keepNext/>
+        <w:keepLines/>
+        <w:spacing w:before="0" w:after="0" w:line="364" w:lineRule="exact"/>
+        <w:ind w:left="4680"/>
+      </w:pPr>
+      <w:r>
+        <w:t xml:space="preserve">BINGHAM</w:t>
+      </w:r>
+      <w:r>
+        <w:t xml:space="preserve"> </w:t>
+      </w:r>
+      <w:r>
+        <w:t xml:space="preserve">GREENEBAUM</w:t>
+      </w:r>
+      <w:r>
+        <w:t xml:space="preserve"> </w:t>
+      </w:r>
+      <w:r>
+        <w:t xml:space="preserve">DOLL</w:t>
+      </w:r>
+      <w:r>
+        <w:t xml:space="preserve"> </w:t>
+      </w:r>
+      <w:r>
+        <w:t xml:space="preserve">LLP</w:t>
+      </w:r>
+    </w:p>
+    <w:p>
+      <w:pPr>
+        <w:pStyle w:val="BapLine"/>
+        <w:keepNext/>
+        <w:keepLines/>
+        <w:spacing w:before="0" w:after="0" w:line="364" w:lineRule="exact"/>
+        <w:ind w:left="4680"/>
       </w:pPr>
       <w:r>
         <w:t xml:space="preserve">kmiller@bgdlegal.com</w:t>
@@ -994,18 +3921,32 @@
     </w:p>
     <w:p>
       <w:pPr>
-        <w:pStyle w:val="SignatureDate"/>
-      </w:pPr>
-      <w:r>
-        <w:t xml:space="preserve">September 12, 2019</w:t>
+        <w:pStyle w:val="BapLine"/>
+        <w:keepLines/>
+        <w:spacing w:before="224" w:after="0" w:line="364" w:lineRule="exact"/>
+        <w:ind w:left="4680"/>
+      </w:pPr>
+      <w:r>
+        <w:t xml:space="preserve">September</w:t>
+      </w:r>
+      <w:r>
+        <w:t xml:space="preserve"> </w:t>
+      </w:r>
+      <w:r>
+        <w:t xml:space="preserve">12,</w:t>
+      </w:r>
+      <w:r>
+        <w:t xml:space="preserve"> </w:t>
+      </w:r>
+      <w:r>
+        <w:t xml:space="preserve">2019</w:t>
       </w:r>
     </w:p>
     <w:sectPr>
-      <w:footerReference w:type="default" r:id="rIdFtrPage"/>
+      <w:footerReference w:type="default" r:id="rIdBapPage"/>
       <w:pgSz w:w="12240" w:h="15840"/>
       <w:pgMar w:top="1440" w:right="1440" w:bottom="1440" w:left="1440" w:header="720" w:footer="720" w:gutter="0"/>
       <w:pgNumType w:fmt="decimal" w:start="1"/>
-      <w:cols w:space="720"/>
     </w:sectPr>
   </w:body>
 </w:document>
@@ -1074,6 +4015,33 @@
 </w:ftr>
 </file>
 
+<file path=word/ftr-own1.xml><?xml version="1.0" encoding="utf-8"?>
+<w:ftr xmlns:w="http://schemas.openxmlformats.org/wordprocessingml/2006/main" xmlns:r="http://schemas.openxmlformats.org/officeDocument/2006/relationships">
+  <w:p>
+    <w:pPr>
+      <w:spacing w:before="0" w:after="0" w:line="364" w:lineRule="exact"/>
+      <w:ind w:firstLine="0"/>
+      <w:jc w:val="center"/>
+    </w:pPr>
+    <w:r>
+      <w:fldChar w:fldCharType="begin"/>
+    </w:r>
+    <w:r>
+      <w:instrText xml:space="preserve"> PAGE </w:instrText>
+    </w:r>
+    <w:r>
+      <w:fldChar w:fldCharType="separate"/>
+    </w:r>
+    <w:r>
+      <w:t>1</w:t>
+    </w:r>
+    <w:r>
+      <w:fldChar w:fldCharType="end"/>
+    </w:r>
+  </w:p>
+</w:ftr>
+</file>
+
 <file path=word/ftr-page.xml><?xml version="1.0" encoding="utf-8"?>
 <w:ftr xmlns:w="http://schemas.openxmlformats.org/wordprocessingml/2006/main" xmlns:r="http://schemas.openxmlformats.org/officeDocument/2006/relationships">
   <w:p>
@@ -1192,12 +4160,13 @@
         <w:rFonts w:ascii="Times New Roman" w:hAnsi="Times New Roman" w:eastAsia="Times New Roman" w:cs="Times New Roman"/>
         <w:sz w:val="28"/>
         <w:szCs w:val="28"/>
-        <w:lang w:val="en-US" w:eastAsia="en-US" w:bidi="ar-SA"/>
+        <w:lang w:val="en-US" w:eastAsia="zh-CN" w:bidi="ar-SA"/>
       </w:rPr>
     </w:rPrDefault>
     <w:pPrDefault>
       <w:pPr>
-        <w:spacing w:before="0" w:after="0" w:line="376" w:lineRule="exact"/>
+        <w:widowControl/>
+        <w:spacing w:after="0"/>
       </w:pPr>
     </w:pPrDefault>
   </w:docDefaults>
@@ -1205,10 +4174,6 @@
   <w:style w:type="paragraph" w:default="1" w:styleId="Normal">
     <w:name w:val="Normal"/>
     <w:qFormat/>
-    <w:pPr>
-      <w:spacing w:before="0" w:after="0" w:line="376" w:lineRule="exact"/>
-      <w:ind w:firstLine="0"/>
-    </w:pPr>
   </w:style>
   <w:style w:type="paragraph" w:styleId="BodyText">
     <w:name w:val="Body Text"/>
@@ -1216,17 +4181,17 @@
     <w:link w:val="BodyTextChar"/>
     <w:qFormat/>
     <w:pPr>
-      <w:spacing w:before="0" w:after="0" w:line="742" w:lineRule="exact"/>
-      <w:ind w:firstLine="720"/>
+      <w:spacing w:before="0" w:after="0" w:line="728" w:lineRule="exact"/>
+      <w:ind w:firstLine="720" w:right="2"/>
     </w:pPr>
   </w:style>
-  <w:style w:type="paragraph" w:styleId="FirstParagraph">
+  <w:style w:type="paragraph" w:customStyle="1" w:styleId="FirstParagraph">
     <w:name w:val="First Paragraph"/>
     <w:basedOn w:val="BodyText"/>
     <w:next w:val="BodyText"/>
     <w:qFormat/>
     <w:pPr>
-      <w:ind w:firstLine="0"/>
+      <w:ind w:right="2" w:firstLine="0"/>
     </w:pPr>
   </w:style>
   <w:style w:type="paragraph" w:customStyle="1" w:styleId="Compact">
@@ -1234,7 +4199,7 @@
     <w:basedOn w:val="BodyText"/>
     <w:qFormat/>
     <w:pPr>
-      <w:ind w:firstLine="0"/>
+      <w:spacing w:before="36" w:after="36"/>
     </w:pPr>
   </w:style>
   <w:style w:type="paragraph" w:styleId="Title">
@@ -1374,81 +4339,105 @@
     <w:name w:val="heading 1"/>
     <w:basedOn w:val="Normal"/>
     <w:next w:val="BodyText"/>
+    <w:link w:val="Heading1Char"/>
     <w:uiPriority w:val="9"/>
     <w:qFormat/>
+    <w:rsid w:val="00A10FD9"/>
     <w:pPr>
       <w:keepNext/>
       <w:keepLines/>
-      <w:spacing w:before="349" w:after="0" w:line="527" w:lineRule="exact"/>
+      <w:spacing w:before="240" w:after="120" w:line="364" w:lineRule="exact"/>
       <w:ind w:firstLine="0"/>
       <w:jc w:val="center"/>
       <w:outlineLvl w:val="0"/>
     </w:pPr>
     <w:rPr>
+      <w:rFonts w:ascii="Times New Roman" w:hAnsi="Times New Roman" w:eastAsia="Times New Roman" w:cs="Times New Roman"/>
       <w:b/>
       <w:bCs/>
+      <w:caps/>
       <w:color w:val="000000"/>
-      <w:sz w:val="39"/>
-      <w:szCs w:val="39"/>
+      <w:sz w:val="28"/>
+      <w:szCs w:val="28"/>
     </w:rPr>
   </w:style>
   <w:style w:type="paragraph" w:styleId="Heading2">
     <w:name w:val="heading 2"/>
     <w:basedOn w:val="Normal"/>
     <w:next w:val="BodyText"/>
+    <w:link w:val="Heading2Char"/>
     <w:uiPriority w:val="9"/>
+    <w:semiHidden/>
+    <w:unhideWhenUsed/>
     <w:qFormat/>
+    <w:rsid w:val="00A10FD9"/>
     <w:pPr>
       <w:keepNext/>
       <w:keepLines/>
-      <w:spacing w:before="181" w:after="0" w:line="446" w:lineRule="exact"/>
+      <w:spacing w:before="240" w:after="120" w:line="364" w:lineRule="exact"/>
       <w:ind w:firstLine="0"/>
       <w:outlineLvl w:val="1"/>
     </w:pPr>
     <w:rPr>
+      <w:rFonts w:ascii="Times New Roman" w:hAnsi="Times New Roman" w:eastAsia="Times New Roman" w:cs="Times New Roman"/>
       <w:b/>
       <w:bCs/>
       <w:color w:val="000000"/>
-      <w:sz w:val="34"/>
-      <w:szCs w:val="34"/>
+      <w:sz w:val="28"/>
+      <w:szCs w:val="28"/>
     </w:rPr>
   </w:style>
   <w:style w:type="paragraph" w:styleId="Heading3">
     <w:name w:val="heading 3"/>
     <w:basedOn w:val="Normal"/>
     <w:next w:val="BodyText"/>
+    <w:link w:val="Heading3Char"/>
     <w:uiPriority w:val="9"/>
+    <w:semiHidden/>
+    <w:unhideWhenUsed/>
     <w:qFormat/>
+    <w:rsid w:val="00A10FD9"/>
     <w:pPr>
       <w:keepNext/>
       <w:keepLines/>
-      <w:spacing w:before="160" w:after="0" w:line="372" w:lineRule="exact"/>
-      <w:ind w:left="720" w:firstLine="0"/>
+      <w:spacing w:before="240" w:after="120" w:line="364" w:lineRule="exact"/>
+      <w:ind w:firstLine="0"/>
       <w:outlineLvl w:val="2"/>
     </w:pPr>
     <w:rPr>
+      <w:rFonts w:ascii="Times New Roman" w:hAnsi="Times New Roman" w:eastAsia="Times New Roman" w:cs="Times New Roman"/>
       <w:b/>
       <w:bCs/>
       <w:color w:val="000000"/>
+      <w:sz w:val="28"/>
+      <w:szCs w:val="28"/>
     </w:rPr>
   </w:style>
   <w:style w:type="paragraph" w:styleId="Heading4">
     <w:name w:val="heading 4"/>
     <w:basedOn w:val="Normal"/>
     <w:next w:val="BodyText"/>
+    <w:link w:val="Heading4Char"/>
     <w:uiPriority w:val="9"/>
+    <w:semiHidden/>
+    <w:unhideWhenUsed/>
     <w:qFormat/>
+    <w:rsid w:val="00A10FD9"/>
     <w:pPr>
       <w:keepNext/>
       <w:keepLines/>
-      <w:spacing w:before="160" w:after="0" w:line="376" w:lineRule="exact"/>
-      <w:ind w:left="1440" w:firstLine="0"/>
+      <w:spacing w:before="240" w:after="120" w:line="364" w:lineRule="exact"/>
+      <w:ind w:firstLine="0"/>
       <w:outlineLvl w:val="3"/>
     </w:pPr>
     <w:rPr>
+      <w:rFonts w:ascii="Times New Roman" w:hAnsi="Times New Roman" w:eastAsia="Times New Roman" w:cs="Times New Roman"/>
+      <w:b/>
+      <w:bCs/>
       <w:i/>
-      <w:iCs/>
       <w:color w:val="000000"/>
+      <w:sz w:val="28"/>
+      <w:szCs w:val="28"/>
     </w:rPr>
   </w:style>
   <w:style w:type="paragraph" w:styleId="Heading5">
@@ -1464,12 +4453,18 @@
     <w:pPr>
       <w:keepNext/>
       <w:keepLines/>
-      <w:spacing w:before="80" w:after="40"/>
+      <w:spacing w:before="240" w:after="120" w:line="364" w:lineRule="exact"/>
+      <w:ind w:firstLine="0"/>
       <w:outlineLvl w:val="4"/>
     </w:pPr>
     <w:rPr>
-      <w:rFonts w:cstheme="majorBidi"/>
-      <w:color w:val="0F4761" w:themeColor="accent1" w:themeShade="BF"/>
+      <w:rFonts w:ascii="Times New Roman" w:hAnsi="Times New Roman" w:eastAsia="Times New Roman" w:cs="Times New Roman"/>
+      <w:b/>
+      <w:bCs/>
+      <w:i/>
+      <w:color w:val="000000"/>
+      <w:sz w:val="28"/>
+      <w:szCs w:val="28"/>
     </w:rPr>
   </w:style>
   <w:style w:type="paragraph" w:styleId="Heading6">
@@ -1681,22 +4676,26 @@
   </w:style>
   <w:style w:type="paragraph" w:styleId="BlockText">
     <w:name w:val="Block Text"/>
-    <w:basedOn w:val="Normal"/>
+    <w:basedOn w:val="BodyText"/>
     <w:next w:val="BodyText"/>
+    <w:uiPriority w:val="9"/>
+    <w:unhideWhenUsed/>
     <w:qFormat/>
     <w:pPr>
-      <w:spacing w:before="280" w:after="392" w:line="376" w:lineRule="exact"/>
-      <w:ind w:left="720" w:right="720" w:firstLine="0"/>
+      <w:spacing w:before="280" w:after="280" w:line="364" w:lineRule="exact"/>
+      <w:ind w:firstLine="0" w:left="720" w:right="720"/>
     </w:pPr>
   </w:style>
   <w:style w:type="paragraph" w:styleId="FootnoteText">
     <w:name w:val="Footnote Text"/>
     <w:basedOn w:val="Normal"/>
+    <w:next w:val="FootnoteText"/>
     <w:uiPriority w:val="9"/>
     <w:unhideWhenUsed/>
+    <w:qFormat/>
     <w:pPr>
-      <w:spacing w:before="0" w:after="0" w:line="376" w:lineRule="exact"/>
-      <w:ind w:firstLine="0"/>
+      <w:keepLines/>
+      <w:spacing w:before="0" w:after="140" w:line="364" w:lineRule="exact"/>
     </w:pPr>
     <w:rPr>
       <w:sz w:val="28"/>
@@ -1711,8 +4710,8 @@
     <w:unhideWhenUsed/>
     <w:qFormat/>
     <w:pPr>
-      <w:spacing w:before="100" w:after="100"/>
-      <w:ind w:firstLine="0" w:left="480" w:right="480"/>
+      <w:spacing w:before="280" w:after="280"/>
+      <w:ind w:firstLine="0" w:left="720" w:right="720"/>
     </w:pPr>
   </w:style>
   <w:style w:type="character" w:default="1" w:styleId="DefaultParagraphFont">
@@ -1820,7 +4819,7 @@
     <w:name w:val="Hyperlink"/>
     <w:basedOn w:val="BodyTextChar"/>
     <w:rPr>
-      <w:color w:val="4F81BD" w:themeColor="accent1"/>
+      <w:color w:val="000000"/>
     </w:rPr>
   </w:style>
   <w:style w:type="paragraph" w:styleId="TOCHeading">
@@ -1841,317 +4840,56 @@
       <w:color w:val="365F91" w:themeColor="accent1" w:themeShade="BF"/>
     </w:rPr>
   </w:style>
-  <w:style w:type="paragraph" w:customStyle="1" w:styleId="CertText">
-    <w:name w:val="Cert Text"/>
-    <w:basedOn w:val="FirstParagraph"/>
+  <w:style w:type="paragraph" w:customStyle="1" w:styleId="ListItem">
+    <w:name w:val="List Item"/>
+    <w:basedOn w:val="BodyText"/>
     <w:qFormat/>
     <w:pPr>
-      <w:keepNext/>
-      <w:keepLines/>
+      <w:spacing w:before="0" w:after="0" w:line="728" w:lineRule="exact"/>
+      <w:ind w:left="720" w:hanging="720"/>
     </w:pPr>
   </w:style>
-  <w:style w:type="paragraph" w:customStyle="1" w:styleId="Heading1Top">
-    <w:name w:val="Heading 1 Top"/>
-    <w:basedOn w:val="Heading1"/>
-    <w:next w:val="FirstParagraph"/>
-    <w:qFormat/>
-    <w:pPr>
-      <w:spacing w:before="0"/>
-      <w:outlineLvl w:val="0"/>
-    </w:pPr>
-  </w:style>
-  <w:style w:type="paragraph" w:customStyle="1" w:styleId="Centered">
-    <w:name w:val="Centered"/>
+  <w:style w:type="paragraph" w:customStyle="1" w:styleId="BapLine">
+    <w:name w:val="Bap Line"/>
     <w:basedOn w:val="Normal"/>
     <w:qFormat/>
     <w:pPr>
-      <w:jc w:val="center"/>
+      <w:spacing w:before="0" w:after="0" w:line="364" w:lineRule="exact"/>
+      <w:ind w:left="0" w:firstLine="0"/>
     </w:pPr>
   </w:style>
-  <w:style w:type="paragraph" w:customStyle="1" w:styleId="CoverGap">
-    <w:name w:val="CoverGap"/>
-    <w:basedOn w:val="Centered"/>
-    <w:qFormat/>
-    <w:pPr>
-      <w:spacing w:before="70"/>
-    </w:pPr>
-  </w:style>
-  <w:style w:type="paragraph" w:customStyle="1" w:styleId="CoverWide">
-    <w:name w:val="CoverWide"/>
-    <w:basedOn w:val="Centered"/>
-    <w:qFormat/>
-    <w:pPr>
-      <w:spacing w:before="758"/>
-    </w:pPr>
-  </w:style>
-  <w:style w:type="paragraph" w:customStyle="1" w:styleId="CoverTitle">
-    <w:name w:val="CoverTitle"/>
-    <w:basedOn w:val="Centered"/>
-    <w:qFormat/>
-    <w:pPr>
-      <w:spacing w:before="600" w:line="420" w:lineRule="exact"/>
-    </w:pPr>
-    <w:rPr>
-      <w:b/>
-      <w:bCs/>
-      <w:caps/>
-      <w:sz w:val="32"/>
-      <w:szCs w:val="32"/>
-    </w:rPr>
-  </w:style>
-  <w:style w:type="paragraph" w:customStyle="1" w:styleId="CoverBottom">
-    <w:name w:val="CoverBottom"/>
-    <w:basedOn w:val="Centered"/>
-    <w:qFormat/>
-    <w:pPr>
-      <w:spacing w:before="360"/>
-    </w:pPr>
-  </w:style>
-  <w:style w:type="paragraph" w:customStyle="1" w:styleId="CoverGroup">
-    <w:name w:val="CoverGroup"/>
-    <w:basedOn w:val="Centered"/>
-    <w:qFormat/>
-    <w:pPr>
-      <w:spacing w:before="360"/>
-    </w:pPr>
-  </w:style>
-  <w:style w:type="paragraph" w:customStyle="1" w:styleId="CoverDate">
-    <w:name w:val="CoverDate"/>
-    <w:basedOn w:val="Centered"/>
-    <w:qFormat/>
-    <w:pPr>
-      <w:spacing w:before="160"/>
-    </w:pPr>
-  </w:style>
-  <w:style w:type="paragraph" w:customStyle="1" w:styleId="SectionEnd">
-    <w:name w:val="SectionEnd"/>
+  <w:style w:type="paragraph" w:customStyle="1" w:styleId="BapQuote">
+    <w:name w:val="Bap Quote"/>
     <w:basedOn w:val="Normal"/>
     <w:qFormat/>
     <w:pPr>
-      <w:spacing w:before="0" w:after="0" w:line="20" w:lineRule="exact"/>
+      <w:spacing w:before="0" w:after="0" w:line="364" w:lineRule="exact"/>
+      <w:ind w:left="720" w:right="720" w:firstLine="0"/>
     </w:pPr>
-    <w:rPr>
-      <w:sz w:val="2"/>
-      <w:szCs w:val="2"/>
-    </w:rPr>
-  </w:style>
-  <w:style w:type="paragraph" w:customStyle="1" w:styleId="Single">
-    <w:name w:val="Single"/>
-    <w:basedOn w:val="Normal"/>
+  </w:style>
+  <w:style w:type="paragraph" w:customStyle="1" w:styleId="BapQuoteFirst">
+    <w:name w:val="Bap Quote First"/>
+    <w:basedOn w:val="BapQuote"/>
     <w:qFormat/>
     <w:pPr>
-      <w:spacing w:before="0" w:after="0" w:line="376" w:lineRule="exact"/>
-      <w:ind w:firstLine="0"/>
+      <w:spacing w:before="280" w:after="0" w:line="364" w:lineRule="exact"/>
     </w:pPr>
   </w:style>
-  <w:style w:type="paragraph" w:customStyle="1" w:styleId="FrontHeading">
-    <w:name w:val="FrontHeading"/>
-    <w:basedOn w:val="Normal"/>
-    <w:next w:val="FirstParagraph"/>
+  <w:style w:type="paragraph" w:customStyle="1" w:styleId="BapQuoteLast">
+    <w:name w:val="Bap Quote Last"/>
+    <w:basedOn w:val="BapQuote"/>
     <w:qFormat/>
     <w:pPr>
-      <w:keepNext/>
-      <w:keepLines/>
-      <w:spacing w:before="0" w:after="0" w:line="527" w:lineRule="exact"/>
-      <w:ind w:firstLine="0"/>
-      <w:jc w:val="center"/>
+      <w:spacing w:before="0" w:after="392" w:line="364" w:lineRule="exact"/>
     </w:pPr>
-    <w:rPr>
-      <w:b/>
-      <w:bCs/>
-      <w:sz w:val="39"/>
-      <w:szCs w:val="39"/>
-    </w:rPr>
-  </w:style>
-  <w:style w:type="paragraph" w:customStyle="1" w:styleId="CertHeading">
-    <w:name w:val="CertHeading"/>
-    <w:basedOn w:val="FrontHeading"/>
+  </w:style>
+  <w:style w:type="paragraph" w:customStyle="1" w:styleId="BapQuoteOnly">
+    <w:name w:val="Bap Quote Only"/>
+    <w:basedOn w:val="BapQuote"/>
     <w:qFormat/>
     <w:pPr>
-      <w:spacing w:before="349"/>
+      <w:spacing w:before="280" w:after="392" w:line="364" w:lineRule="exact"/>
     </w:pPr>
-  </w:style>
-  <w:style w:type="paragraph" w:customStyle="1" w:styleId="FrontHeadingBreak">
-    <w:name w:val="FrontHeadingBreak"/>
-    <w:basedOn w:val="FrontHeading"/>
-    <w:qFormat/>
-    <w:pPr>
-      <w:pageBreakBefore/>
-    </w:pPr>
-  </w:style>
-  <w:style w:type="paragraph" w:customStyle="1" w:styleId="ContentsHeading">
-    <w:name w:val="ContentsHeading"/>
-    <w:basedOn w:val="FrontHeading"/>
-    <w:qFormat/>
-    <w:pPr>
-      <w:spacing w:after="305"/>
-    </w:pPr>
-  </w:style>
-  <w:style w:type="paragraph" w:customStyle="1" w:styleId="ContentsHeadingBreak">
-    <w:name w:val="ContentsHeadingBreak"/>
-    <w:basedOn w:val="ContentsHeading"/>
-    <w:qFormat/>
-    <w:pPr>
-      <w:pageBreakBefore/>
-    </w:pPr>
-  </w:style>
-  <w:style w:type="paragraph" w:customStyle="1" w:styleId="AuthoritiesHeading">
-    <w:name w:val="AuthoritiesHeading"/>
-    <w:basedOn w:val="FrontHeadingBreak"/>
-    <w:qFormat/>
-    <w:pPr>
-      <w:spacing w:before="0" w:after="143"/>
-    </w:pPr>
-  </w:style>
-  <w:style w:type="paragraph" w:customStyle="1" w:styleId="AuthorityKind">
-    <w:name w:val="AuthorityKind"/>
-    <w:basedOn w:val="Single"/>
-    <w:next w:val="TOAEntry"/>
-    <w:qFormat/>
-    <w:pPr>
-      <w:keepNext/>
-      <w:spacing w:before="160" w:after="40"/>
-    </w:pPr>
-    <w:rPr>
-      <w:b/>
-      <w:bCs/>
-    </w:rPr>
-  </w:style>
-  <w:style w:type="paragraph" w:customStyle="1" w:styleId="TOAEntry">
-    <w:name w:val="TOA Entry"/>
-    <w:basedOn w:val="Single"/>
-    <w:qFormat/>
-    <w:pPr>
-      <w:keepLines/>
-      <w:tabs>
-        <w:tab w:val="right" w:leader="dot" w:pos="9350"/>
-      </w:tabs>
-      <w:spacing w:after="0"/>
-      <w:ind w:left="720" w:right="720" w:hanging="720"/>
-    </w:pPr>
-  </w:style>
-  <w:style w:type="paragraph" w:customStyle="1" w:styleId="TOCEntry1">
-    <w:name w:val="TOC Entry 1"/>
-    <w:basedOn w:val="Single"/>
-    <w:qFormat/>
-    <w:pPr>
-      <w:keepLines/>
-      <w:tabs>
-        <w:tab w:val="right" w:pos="9350"/>
-      </w:tabs>
-      <w:spacing w:after="0"/>
-      <w:ind w:left="420" w:right="720" w:hanging="420"/>
-    </w:pPr>
-  </w:style>
-  <w:style w:type="paragraph" w:customStyle="1" w:styleId="TOCEntry2">
-    <w:name w:val="TOC Entry 2"/>
-    <w:basedOn w:val="TOCEntry1"/>
-    <w:qFormat/>
-    <w:pPr>
-      <w:ind w:left="840" w:right="720" w:hanging="420"/>
-    </w:pPr>
-  </w:style>
-  <w:style w:type="paragraph" w:customStyle="1" w:styleId="TOCEntry3">
-    <w:name w:val="TOC Entry 3"/>
-    <w:basedOn w:val="TOCEntry1"/>
-    <w:qFormat/>
-    <w:pPr>
-      <w:ind w:left="1260" w:right="720" w:hanging="420"/>
-    </w:pPr>
-  </w:style>
-  <w:style w:type="paragraph" w:customStyle="1" w:styleId="TOCEntry4">
-    <w:name w:val="TOC Entry 4"/>
-    <w:basedOn w:val="TOCEntry1"/>
-    <w:qFormat/>
-    <w:pPr>
-      <w:ind w:left="1680" w:right="720" w:hanging="420"/>
-    </w:pPr>
-  </w:style>
-  <w:style w:type="paragraph" w:customStyle="1" w:styleId="Signature">
-    <w:name w:val="Signature"/>
-    <w:basedOn w:val="Single"/>
-    <w:qFormat/>
-    <w:pPr>
-      <w:keepNext/>
-      <w:keepLines/>
-      <w:ind w:left="4680" w:firstLine="0"/>
-    </w:pPr>
-  </w:style>
-  <w:style w:type="paragraph" w:customStyle="1" w:styleId="SignatureLead">
-    <w:name w:val="SignatureLead"/>
-    <w:basedOn w:val="Signature"/>
-    <w:qFormat/>
-    <w:pPr>
-      <w:spacing w:before="260" w:after="700"/>
-    </w:pPr>
-  </w:style>
-  <w:style w:type="paragraph" w:customStyle="1" w:styleId="SignatureDate">
-    <w:name w:val="SignatureDate"/>
-    <w:basedOn w:val="Signature"/>
-    <w:qFormat/>
-    <w:pPr>
-      <w:keepNext w:val="0"/>
-      <w:spacing w:before="590"/>
-    </w:pPr>
-  </w:style>
-  <w:style w:type="paragraph" w:customStyle="1" w:styleId="KeepWithNext">
-    <w:name w:val="Keep With Next"/>
-    <w:basedOn w:val="BodyText"/>
-    <w:qFormat/>
-    <w:pPr>
-      <w:keepNext/>
-      <w:keepLines/>
-    </w:pPr>
-  </w:style>
-  <w:style w:type="paragraph" w:styleId="Footer">
-    <w:name w:val="footer"/>
-    <w:basedOn w:val="Normal"/>
-    <w:uiPriority w:val="99"/>
-    <w:unhideWhenUsed/>
-    <w:pPr>
-      <w:spacing w:before="0" w:after="0" w:line="240" w:lineRule="auto"/>
-      <w:ind w:firstLine="0"/>
-      <w:jc w:val="center"/>
-    </w:pPr>
-    <w:rPr>
-      <w:sz w:val="28"/>
-      <w:szCs w:val="28"/>
-    </w:rPr>
-  </w:style>
-  <w:style w:type="paragraph" w:customStyle="1" w:styleId="CertText">
-    <w:name w:val="CertText"/>
-    <w:basedOn w:val="BodyText"/>
-    <w:qFormat/>
-  </w:style>
-  <w:style w:type="paragraph" w:customStyle="1" w:styleId="FirstParagraph">
-    <w:name w:val="FirstParagraph"/>
-    <w:basedOn w:val="BodyText"/>
-    <w:qFormat/>
-  </w:style>
-  <w:style w:type="paragraph" w:customStyle="1" w:styleId="Heading1Top">
-    <w:name w:val="Heading1Top"/>
-    <w:basedOn w:val="BodyText"/>
-    <w:qFormat/>
-  </w:style>
-  <w:style w:type="paragraph" w:customStyle="1" w:styleId="TOAEntry">
-    <w:name w:val="TOAEntry"/>
-    <w:basedOn w:val="BodyText"/>
-    <w:qFormat/>
-  </w:style>
-  <w:style w:type="paragraph" w:customStyle="1" w:styleId="TOCEntry1">
-    <w:name w:val="TOCEntry1"/>
-    <w:basedOn w:val="BodyText"/>
-    <w:qFormat/>
-  </w:style>
-  <w:style w:type="paragraph" w:customStyle="1" w:styleId="TOCEntry2">
-    <w:name w:val="TOCEntry2"/>
-    <w:basedOn w:val="BodyText"/>
-    <w:qFormat/>
-  </w:style>
-  <w:style w:type="paragraph" w:customStyle="1" w:styleId="TOCEntry3">
-    <w:name w:val="TOCEntry3"/>
-    <w:basedOn w:val="BodyText"/>
-    <w:qFormat/>
   </w:style>
   <w:style w:type="paragraph" w:customStyle="1" w:styleId="SourceCode">
     <w:name w:val="Source Code"/>

</xml_diff>